<commit_message>
Final Version used 2024/25
</commit_message>
<xml_diff>
--- a/Quittung-Template.docx
+++ b/Quittung-Template.docx
@@ -1,13 +1,13 @@
 
 <file path=word/document.xml><?xml version="1.0" encoding="utf-8"?>
-<w:document xmlns:wpc="http://schemas.microsoft.com/office/word/2010/wordprocessingCanvas" xmlns:cx="http://schemas.microsoft.com/office/drawing/2014/chartex" xmlns:cx1="http://schemas.microsoft.com/office/drawing/2015/9/8/chartex" xmlns:cx2="http://schemas.microsoft.com/office/drawing/2015/10/21/chartex" xmlns:cx3="http://schemas.microsoft.com/office/drawing/2016/5/9/chartex" xmlns:cx4="http://schemas.microsoft.com/office/drawing/2016/5/10/chartex" xmlns:cx5="http://schemas.microsoft.com/office/drawing/2016/5/11/chartex" xmlns:cx6="http://schemas.microsoft.com/office/drawing/2016/5/12/chartex" xmlns:cx7="http://schemas.microsoft.com/office/drawing/2016/5/13/chartex" xmlns:cx8="http://schemas.microsoft.com/office/drawing/2016/5/14/chartex" xmlns:mc="http://schemas.openxmlformats.org/markup-compatibility/2006" xmlns:aink="http://schemas.microsoft.com/office/drawing/2016/ink" xmlns:am3d="http://schemas.microsoft.com/office/drawing/2017/model3d" xmlns:o="urn:schemas-microsoft-com:office:office" xmlns:r="http://schemas.openxmlformats.org/officeDocument/2006/relationships" xmlns:m="http://schemas.openxmlformats.org/officeDocument/2006/math" xmlns:v="urn:schemas-microsoft-com:vml" xmlns:wp14="http://schemas.microsoft.com/office/word/2010/wordprocessingDrawing" xmlns:wp="http://schemas.openxmlformats.org/drawingml/2006/wordprocessingDrawing" xmlns:w10="urn:schemas-microsoft-com:office:word" xmlns:w="http://schemas.openxmlformats.org/wordprocessingml/2006/main" xmlns:w14="http://schemas.microsoft.com/office/word/2010/wordml" xmlns:w15="http://schemas.microsoft.com/office/word/2012/wordml" xmlns:w16cex="http://schemas.microsoft.com/office/word/2018/wordml/cex" xmlns:w16cid="http://schemas.microsoft.com/office/word/2016/wordml/cid" xmlns:w16="http://schemas.microsoft.com/office/word/2018/wordml" xmlns:w16sdtdh="http://schemas.microsoft.com/office/word/2020/wordml/sdtdatahash" xmlns:w16se="http://schemas.microsoft.com/office/word/2015/wordml/symex" xmlns:wpg="http://schemas.microsoft.com/office/word/2010/wordprocessingGroup" xmlns:wpi="http://schemas.microsoft.com/office/word/2010/wordprocessingInk" xmlns:wne="http://schemas.microsoft.com/office/word/2006/wordml" xmlns:wps="http://schemas.microsoft.com/office/word/2010/wordprocessingShape" mc:Ignorable="w14 w15 w16se w16cid w16 w16cex w16sdtdh wp14">
+<w:document xmlns:wpc="http://schemas.microsoft.com/office/word/2010/wordprocessingCanvas" xmlns:cx="http://schemas.microsoft.com/office/drawing/2014/chartex" xmlns:cx1="http://schemas.microsoft.com/office/drawing/2015/9/8/chartex" xmlns:cx2="http://schemas.microsoft.com/office/drawing/2015/10/21/chartex" xmlns:cx3="http://schemas.microsoft.com/office/drawing/2016/5/9/chartex" xmlns:cx4="http://schemas.microsoft.com/office/drawing/2016/5/10/chartex" xmlns:cx5="http://schemas.microsoft.com/office/drawing/2016/5/11/chartex" xmlns:cx6="http://schemas.microsoft.com/office/drawing/2016/5/12/chartex" xmlns:cx7="http://schemas.microsoft.com/office/drawing/2016/5/13/chartex" xmlns:cx8="http://schemas.microsoft.com/office/drawing/2016/5/14/chartex" xmlns:mc="http://schemas.openxmlformats.org/markup-compatibility/2006" xmlns:aink="http://schemas.microsoft.com/office/drawing/2016/ink" xmlns:am3d="http://schemas.microsoft.com/office/drawing/2017/model3d" xmlns:o="urn:schemas-microsoft-com:office:office" xmlns:r="http://schemas.openxmlformats.org/officeDocument/2006/relationships" xmlns:m="http://schemas.openxmlformats.org/officeDocument/2006/math" xmlns:v="urn:schemas-microsoft-com:vml" xmlns:wp14="http://schemas.microsoft.com/office/word/2010/wordprocessingDrawing" xmlns:wp="http://schemas.openxmlformats.org/drawingml/2006/wordprocessingDrawing" xmlns:w10="urn:schemas-microsoft-com:office:word" xmlns:w="http://schemas.openxmlformats.org/wordprocessingml/2006/main" xmlns:w14="http://schemas.microsoft.com/office/word/2010/wordml" xmlns:w15="http://schemas.microsoft.com/office/word/2012/wordml" xmlns:w16cid="http://schemas.microsoft.com/office/word/2016/wordml/cid" xmlns:w16se="http://schemas.microsoft.com/office/word/2015/wordml/symex" xmlns:wpg="http://schemas.microsoft.com/office/word/2010/wordprocessingGroup" xmlns:wpi="http://schemas.microsoft.com/office/word/2010/wordprocessingInk" xmlns:wne="http://schemas.microsoft.com/office/word/2006/wordml" xmlns:wps="http://schemas.microsoft.com/office/word/2010/wordprocessingShape" mc:Ignorable="w14 w15 w16se w16cid wp14">
   <w:body>
     <w:p>
       <w:pPr>
         <w:jc w:val="center"/>
         <w:rPr>
-          <w:rFonts w:ascii="Times New Roman" w:hAnsi="Times New Roman" w:cs="Times New Roman"/>
-          <w:sz w:val="48"/>
+          <w:rFonts w:asciiTheme="minorHAnsi" w:hAnsiTheme="minorHAnsi" w:cstheme="majorHAnsi"/>
+          <w:sz w:val="52"/>
           <w:szCs w:val="48"/>
           <w:lang w:val="bg-BG"/>
         </w:rPr>
@@ -18,522 +18,593 @@
         <w:jc w:val="center"/>
         <w:outlineLvl w:val="0"/>
         <w:rPr>
-          <w:rFonts w:ascii="Times New Roman" w:hAnsi="Times New Roman" w:cs="Times New Roman"/>
+          <w:rFonts w:asciiTheme="minorHAnsi" w:hAnsiTheme="minorHAnsi" w:cstheme="majorHAnsi"/>
+          <w:b/>
+          <w:sz w:val="40"/>
+          <w:szCs w:val="36"/>
+        </w:rPr>
+      </w:pPr>
+      <w:r>
+        <w:rPr>
+          <w:rFonts w:asciiTheme="minorHAnsi" w:hAnsiTheme="minorHAnsi" w:cstheme="majorHAnsi"/>
+          <w:b/>
+          <w:sz w:val="40"/>
+          <w:szCs w:val="36"/>
+        </w:rPr>
+        <w:t>Q</w:t>
+      </w:r>
+      <w:r>
+        <w:rPr>
+          <w:rFonts w:asciiTheme="minorHAnsi" w:hAnsiTheme="minorHAnsi" w:cstheme="majorHAnsi"/>
+          <w:b/>
+          <w:sz w:val="40"/>
+          <w:szCs w:val="36"/>
+        </w:rPr>
+        <w:t>uittung</w:t>
+      </w:r>
+    </w:p>
+    <w:p>
+      <w:pPr>
+        <w:jc w:val="center"/>
+        <w:rPr>
+          <w:rFonts w:asciiTheme="minorHAnsi" w:hAnsiTheme="minorHAnsi" w:cstheme="majorHAnsi"/>
+          <w:b/>
+          <w:sz w:val="24"/>
+        </w:rPr>
+      </w:pPr>
+    </w:p>
+    <w:p>
+      <w:pPr>
+        <w:jc w:val="center"/>
+        <w:outlineLvl w:val="0"/>
+        <w:rPr>
+          <w:rFonts w:asciiTheme="minorHAnsi" w:hAnsiTheme="minorHAnsi" w:cstheme="majorHAnsi"/>
           <w:b/>
           <w:sz w:val="36"/>
-          <w:szCs w:val="36"/>
-        </w:rPr>
-      </w:pPr>
-      <w:r>
-        <w:rPr>
-          <w:rFonts w:ascii="Times New Roman" w:hAnsi="Times New Roman" w:cs="Times New Roman"/>
+          <w:szCs w:val="32"/>
+          <w:lang w:val="bg-BG"/>
+        </w:rPr>
+      </w:pPr>
+      <w:r>
+        <w:rPr>
+          <w:rFonts w:asciiTheme="minorHAnsi" w:hAnsiTheme="minorHAnsi" w:cstheme="majorHAnsi"/>
           <w:b/>
           <w:sz w:val="36"/>
-          <w:szCs w:val="36"/>
-        </w:rPr>
-        <w:t>Quittung</w:t>
+          <w:szCs w:val="32"/>
+        </w:rPr>
+        <w:t xml:space="preserve">Nr. </w:t>
+      </w:r>
+      <w:r>
+        <w:rPr>
+          <w:rFonts w:asciiTheme="minorHAnsi" w:hAnsiTheme="minorHAnsi" w:cstheme="majorHAnsi"/>
+          <w:b/>
+          <w:sz w:val="36"/>
+          <w:szCs w:val="32"/>
+        </w:rPr>
+        <w:t>{{NR}} / {{DATUM}}</w:t>
       </w:r>
     </w:p>
     <w:p>
       <w:pPr>
         <w:jc w:val="center"/>
         <w:rPr>
-          <w:rFonts w:ascii="Times New Roman" w:hAnsi="Times New Roman" w:cs="Times New Roman"/>
-          <w:b/>
+          <w:rFonts w:asciiTheme="minorHAnsi" w:hAnsiTheme="minorHAnsi" w:cstheme="majorHAnsi"/>
+          <w:sz w:val="24"/>
         </w:rPr>
       </w:pPr>
     </w:p>
     <w:p>
       <w:pPr>
         <w:jc w:val="center"/>
+        <w:rPr>
+          <w:rFonts w:asciiTheme="minorHAnsi" w:hAnsiTheme="minorHAnsi" w:cstheme="majorHAnsi"/>
+          <w:sz w:val="24"/>
+        </w:rPr>
+      </w:pPr>
+    </w:p>
+    <w:p>
+      <w:pPr>
+        <w:pStyle w:val="StandardWeb"/>
+        <w:rPr>
+          <w:rFonts w:asciiTheme="minorHAnsi" w:hAnsiTheme="minorHAnsi"/>
+          <w:sz w:val="28"/>
+          <w:lang w:val="de-DE"/>
+        </w:rPr>
+      </w:pPr>
+      <w:r>
+        <w:rPr>
+          <w:rFonts w:asciiTheme="minorHAnsi" w:hAnsiTheme="minorHAnsi"/>
+          <w:sz w:val="28"/>
+          <w:lang w:val="de-DE"/>
+        </w:rPr>
+        <w:t xml:space="preserve">Hiermit bestätigen wir, dass </w:t>
+      </w:r>
+      <w:r>
+        <w:rPr>
+          <w:rStyle w:val="Fett"/>
+          <w:rFonts w:asciiTheme="minorHAnsi" w:hAnsiTheme="minorHAnsi"/>
+          <w:sz w:val="28"/>
+          <w:lang w:val="de-DE"/>
+        </w:rPr>
+        <w:t>{{ELTERN_NAME}}</w:t>
+      </w:r>
+      <w:r>
+        <w:rPr>
+          <w:rFonts w:asciiTheme="minorHAnsi" w:hAnsiTheme="minorHAnsi"/>
+          <w:sz w:val="28"/>
+          <w:lang w:val="de-DE"/>
+        </w:rPr>
+        <w:t xml:space="preserve"> Mitglied bei der Bulgarischen Schule München „</w:t>
+      </w:r>
+      <w:proofErr w:type="spellStart"/>
+      <w:r>
+        <w:rPr>
+          <w:rFonts w:asciiTheme="minorHAnsi" w:hAnsiTheme="minorHAnsi"/>
+          <w:sz w:val="28"/>
+          <w:lang w:val="de-DE"/>
+        </w:rPr>
+        <w:t>Paisii</w:t>
+      </w:r>
+      <w:proofErr w:type="spellEnd"/>
+      <w:r>
+        <w:rPr>
+          <w:rFonts w:asciiTheme="minorHAnsi" w:hAnsiTheme="minorHAnsi"/>
+          <w:sz w:val="28"/>
+          <w:lang w:val="de-DE"/>
+        </w:rPr>
+        <w:t xml:space="preserve"> </w:t>
+      </w:r>
+      <w:proofErr w:type="spellStart"/>
+      <w:r>
+        <w:rPr>
+          <w:rFonts w:asciiTheme="minorHAnsi" w:hAnsiTheme="minorHAnsi"/>
+          <w:sz w:val="28"/>
+          <w:lang w:val="de-DE"/>
+        </w:rPr>
+        <w:t>Hilendarski</w:t>
+      </w:r>
+      <w:proofErr w:type="spellEnd"/>
+      <w:r>
+        <w:rPr>
+          <w:rFonts w:asciiTheme="minorHAnsi" w:hAnsiTheme="minorHAnsi"/>
+          <w:sz w:val="28"/>
+          <w:lang w:val="de-DE"/>
+        </w:rPr>
+        <w:t>“ e.V. ist.</w:t>
+      </w:r>
+    </w:p>
+    <w:p>
+      <w:pPr>
+        <w:pStyle w:val="StandardWeb"/>
+        <w:rPr>
+          <w:rFonts w:asciiTheme="minorHAnsi" w:hAnsiTheme="minorHAnsi"/>
+          <w:sz w:val="28"/>
+          <w:lang w:val="de-DE"/>
+        </w:rPr>
+      </w:pPr>
+      <w:r>
+        <w:rPr>
+          <w:rFonts w:asciiTheme="minorHAnsi" w:hAnsiTheme="minorHAnsi"/>
+          <w:sz w:val="28"/>
+          <w:lang w:val="de-DE"/>
+        </w:rPr>
+        <w:t xml:space="preserve">Für den Unterricht von </w:t>
+      </w:r>
+      <w:r>
+        <w:rPr>
+          <w:rStyle w:val="Fett"/>
+          <w:rFonts w:asciiTheme="minorHAnsi" w:hAnsiTheme="minorHAnsi"/>
+          <w:sz w:val="28"/>
+          <w:lang w:val="de-DE"/>
+        </w:rPr>
+        <w:t>{{KINDER_NAMEN}}</w:t>
+      </w:r>
+      <w:r>
+        <w:rPr>
+          <w:rFonts w:asciiTheme="minorHAnsi" w:hAnsiTheme="minorHAnsi"/>
+          <w:sz w:val="28"/>
+          <w:lang w:val="de-DE"/>
+        </w:rPr>
+        <w:t xml:space="preserve"> im Schuljahr </w:t>
+      </w:r>
+      <w:r>
+        <w:rPr>
+          <w:rStyle w:val="Fett"/>
+          <w:rFonts w:asciiTheme="minorHAnsi" w:hAnsiTheme="minorHAnsi"/>
+          <w:sz w:val="28"/>
+          <w:lang w:val="de-DE"/>
+        </w:rPr>
+        <w:t>2024/2025</w:t>
+      </w:r>
+      <w:r>
+        <w:rPr>
+          <w:rFonts w:asciiTheme="minorHAnsi" w:hAnsiTheme="minorHAnsi"/>
+          <w:sz w:val="28"/>
+          <w:lang w:val="de-DE"/>
+        </w:rPr>
+        <w:t xml:space="preserve"> wurden folgende Zahlungen geleistet:</w:t>
+      </w:r>
+    </w:p>
+    <w:p>
+      <w:pPr>
+        <w:pStyle w:val="StandardWeb"/>
+        <w:numPr>
+          <w:ilvl w:val="0"/>
+          <w:numId w:val="7"/>
+        </w:numPr>
+        <w:jc w:val="both"/>
+        <w:rPr>
+          <w:rFonts w:asciiTheme="minorHAnsi" w:hAnsiTheme="minorHAnsi"/>
+          <w:sz w:val="28"/>
+          <w:lang w:val="de-DE"/>
+        </w:rPr>
+      </w:pPr>
+      <w:r>
+        <w:rPr>
+          <w:rStyle w:val="Fett"/>
+          <w:rFonts w:asciiTheme="minorHAnsi" w:hAnsiTheme="minorHAnsi"/>
+          <w:b w:val="0"/>
+          <w:sz w:val="28"/>
+          <w:lang w:val="de-DE"/>
+        </w:rPr>
+        <w:t>Mitgliedsbeitrag:</w:t>
+      </w:r>
+      <w:r>
+        <w:rPr>
+          <w:rFonts w:asciiTheme="minorHAnsi" w:hAnsiTheme="minorHAnsi"/>
+          <w:sz w:val="28"/>
+          <w:lang w:val="de-DE"/>
+        </w:rPr>
+        <w:t xml:space="preserve"> </w:t>
+      </w:r>
+      <w:r>
+        <w:rPr>
+          <w:rFonts w:asciiTheme="minorHAnsi" w:hAnsiTheme="minorHAnsi"/>
+          <w:sz w:val="28"/>
+          <w:lang w:val="de-DE"/>
+        </w:rPr>
+        <w:t>{{BETRAG_MITGLIED}}</w:t>
+      </w:r>
+    </w:p>
+    <w:p>
+      <w:pPr>
+        <w:pStyle w:val="StandardWeb"/>
+        <w:numPr>
+          <w:ilvl w:val="0"/>
+          <w:numId w:val="7"/>
+        </w:numPr>
+        <w:rPr>
+          <w:rFonts w:asciiTheme="minorHAnsi" w:hAnsiTheme="minorHAnsi"/>
+          <w:sz w:val="28"/>
+          <w:lang w:val="de-DE"/>
+        </w:rPr>
+      </w:pPr>
+      <w:r>
+        <w:rPr>
+          <w:rStyle w:val="Fett"/>
+          <w:rFonts w:asciiTheme="minorHAnsi" w:hAnsiTheme="minorHAnsi"/>
+          <w:b w:val="0"/>
+          <w:sz w:val="28"/>
+          <w:lang w:val="de-DE"/>
+        </w:rPr>
+        <w:t>Unterrichtsgebühren:</w:t>
+      </w:r>
+      <w:r>
+        <w:rPr>
+          <w:rStyle w:val="Fett"/>
+          <w:rFonts w:asciiTheme="minorHAnsi" w:hAnsiTheme="minorHAnsi"/>
+          <w:sz w:val="28"/>
+          <w:lang w:val="de-DE"/>
+        </w:rPr>
+        <w:t xml:space="preserve"> </w:t>
+      </w:r>
+      <w:r>
+        <w:rPr>
+          <w:rFonts w:asciiTheme="minorHAnsi" w:hAnsiTheme="minorHAnsi"/>
+          <w:sz w:val="28"/>
+          <w:lang w:val="de-DE"/>
+        </w:rPr>
+        <w:t>{{BETRAG_GEBUEHR}}</w:t>
+      </w:r>
+    </w:p>
+    <w:p>
+      <w:pPr>
+        <w:pStyle w:val="StandardWeb"/>
+        <w:rPr>
+          <w:rFonts w:asciiTheme="minorHAnsi" w:hAnsiTheme="minorHAnsi"/>
+          <w:sz w:val="28"/>
+        </w:rPr>
+      </w:pPr>
+      <w:proofErr w:type="spellStart"/>
+      <w:r>
+        <w:rPr>
+          <w:rStyle w:val="Fett"/>
+          <w:rFonts w:asciiTheme="minorHAnsi" w:hAnsiTheme="minorHAnsi"/>
+          <w:sz w:val="28"/>
+        </w:rPr>
+        <w:t>Gesamtbetrag</w:t>
+      </w:r>
+      <w:proofErr w:type="spellEnd"/>
+      <w:r>
+        <w:rPr>
+          <w:rStyle w:val="Fett"/>
+          <w:rFonts w:asciiTheme="minorHAnsi" w:hAnsiTheme="minorHAnsi"/>
+          <w:sz w:val="28"/>
+        </w:rPr>
+        <w:t>:</w:t>
+      </w:r>
+      <w:r>
+        <w:rPr>
+          <w:rFonts w:asciiTheme="minorHAnsi" w:hAnsiTheme="minorHAnsi"/>
+          <w:sz w:val="28"/>
+        </w:rPr>
+        <w:t xml:space="preserve"> {{GESAMTBETRAG}}</w:t>
+      </w:r>
+    </w:p>
+    <w:p>
+      <w:pPr>
+        <w:pStyle w:val="KeinLeerraum"/>
+        <w:rPr>
+          <w:rFonts w:cstheme="majorHAnsi"/>
+          <w:sz w:val="32"/>
+          <w:szCs w:val="28"/>
+        </w:rPr>
+      </w:pPr>
+      <w:bookmarkStart w:id="0" w:name="_GoBack"/>
+      <w:bookmarkEnd w:id="0"/>
+      <w:r>
+        <w:rPr>
+          <w:rFonts w:cstheme="majorHAnsi"/>
+          <w:sz w:val="32"/>
+          <w:szCs w:val="28"/>
+        </w:rPr>
+        <w:t xml:space="preserve"> </w:t>
+      </w:r>
+    </w:p>
+    <w:p>
+      <w:pPr>
+        <w:pStyle w:val="KeinLeerraum"/>
+        <w:rPr>
+          <w:rFonts w:cstheme="majorHAnsi"/>
+          <w:sz w:val="32"/>
+          <w:szCs w:val="28"/>
+        </w:rPr>
+      </w:pPr>
+    </w:p>
+    <w:p>
+      <w:pPr>
+        <w:pStyle w:val="KeinLeerraum"/>
+        <w:rPr>
+          <w:rFonts w:cstheme="majorHAnsi"/>
+          <w:sz w:val="32"/>
+          <w:szCs w:val="28"/>
+        </w:rPr>
+      </w:pPr>
+      <w:r>
+        <w:rPr>
+          <w:rFonts w:cstheme="majorHAnsi"/>
+          <w:sz w:val="32"/>
+          <w:szCs w:val="28"/>
+        </w:rPr>
+        <w:tab/>
+        <w:t xml:space="preserve"> </w:t>
+      </w:r>
+    </w:p>
+    <w:p>
+      <w:pPr>
         <w:outlineLvl w:val="0"/>
         <w:rPr>
-          <w:rFonts w:ascii="Times New Roman" w:hAnsi="Times New Roman" w:cs="Times New Roman"/>
+          <w:rFonts w:asciiTheme="minorHAnsi" w:hAnsiTheme="minorHAnsi" w:cstheme="majorHAnsi"/>
           <w:b/>
           <w:sz w:val="32"/>
-          <w:szCs w:val="32"/>
-          <w:lang w:val="bg-BG"/>
-        </w:rPr>
-      </w:pPr>
-      <w:r>
-        <w:rPr>
-          <w:rFonts w:ascii="Times New Roman" w:hAnsi="Times New Roman" w:cs="Times New Roman"/>
+          <w:szCs w:val="28"/>
+        </w:rPr>
+      </w:pPr>
+      <w:r>
+        <w:rPr>
+          <w:rFonts w:asciiTheme="minorHAnsi" w:hAnsiTheme="minorHAnsi" w:cstheme="majorHAnsi"/>
+          <w:sz w:val="32"/>
+          <w:szCs w:val="28"/>
+        </w:rPr>
+        <w:t>{{DATUM}}</w:t>
+      </w:r>
+      <w:r>
+        <w:rPr>
+          <w:rFonts w:asciiTheme="minorHAnsi" w:hAnsiTheme="minorHAnsi" w:cstheme="majorHAnsi"/>
+          <w:sz w:val="32"/>
+          <w:szCs w:val="28"/>
+        </w:rPr>
+        <w:t xml:space="preserve"> </w:t>
+      </w:r>
+      <w:r>
+        <w:rPr>
+          <w:rFonts w:asciiTheme="minorHAnsi" w:hAnsiTheme="minorHAnsi" w:cstheme="majorHAnsi"/>
+          <w:sz w:val="32"/>
+          <w:szCs w:val="28"/>
+        </w:rPr>
+        <w:tab/>
+      </w:r>
+      <w:r>
+        <w:rPr>
+          <w:rFonts w:asciiTheme="minorHAnsi" w:hAnsiTheme="minorHAnsi" w:cstheme="majorHAnsi"/>
+          <w:sz w:val="32"/>
+          <w:szCs w:val="28"/>
+        </w:rPr>
+        <w:tab/>
+      </w:r>
+      <w:r>
+        <w:rPr>
+          <w:rFonts w:asciiTheme="minorHAnsi" w:hAnsiTheme="minorHAnsi" w:cstheme="majorHAnsi"/>
+          <w:sz w:val="32"/>
+          <w:szCs w:val="28"/>
+        </w:rPr>
+        <w:tab/>
+      </w:r>
+      <w:r>
+        <w:rPr>
+          <w:rFonts w:asciiTheme="minorHAnsi" w:hAnsiTheme="minorHAnsi" w:cstheme="majorHAnsi"/>
           <w:b/>
           <w:sz w:val="32"/>
-          <w:szCs w:val="32"/>
-        </w:rPr>
-        <w:t xml:space="preserve">Nr. </w:t>
-      </w:r>
-      <w:r>
-        <w:rPr>
-          <w:rFonts w:ascii="Times New Roman" w:hAnsi="Times New Roman" w:cs="Times New Roman"/>
+          <w:szCs w:val="28"/>
+        </w:rPr>
+        <w:t xml:space="preserve">Unterschrift: </w:t>
+      </w:r>
+      <w:r>
+        <w:rPr>
+          <w:rFonts w:asciiTheme="minorHAnsi" w:hAnsiTheme="minorHAnsi" w:cstheme="majorHAnsi"/>
           <w:b/>
           <w:sz w:val="32"/>
-          <w:szCs w:val="32"/>
-        </w:rPr>
-        <w:t>{{NR}} / {{DATUM}}</w:t>
+          <w:szCs w:val="28"/>
+        </w:rPr>
+        <w:t>_________________________</w:t>
       </w:r>
     </w:p>
     <w:p>
       <w:pPr>
-        <w:jc w:val="center"/>
-        <w:rPr>
-          <w:rFonts w:ascii="Times New Roman" w:hAnsi="Times New Roman" w:cs="Times New Roman"/>
-        </w:rPr>
-      </w:pPr>
-    </w:p>
-    <w:p>
-      <w:pPr>
-        <w:jc w:val="center"/>
-        <w:rPr>
-          <w:rFonts w:ascii="Times New Roman" w:hAnsi="Times New Roman" w:cs="Times New Roman"/>
-        </w:rPr>
-      </w:pPr>
-    </w:p>
-    <w:p>
-      <w:pPr>
-        <w:pStyle w:val="KeinLeerraum"/>
-        <w:jc w:val="both"/>
-        <w:rPr>
-          <w:rFonts w:ascii="Times New Roman" w:eastAsia="Calibri" w:hAnsi="Times New Roman" w:cs="Times New Roman"/>
-          <w:sz w:val="28"/>
+        <w:rPr>
+          <w:rFonts w:asciiTheme="minorHAnsi" w:hAnsiTheme="minorHAnsi" w:cstheme="majorHAnsi"/>
+          <w:b/>
+          <w:sz w:val="32"/>
           <w:szCs w:val="28"/>
-          <w:lang w:val="de-DE" w:eastAsia="de-DE"/>
-        </w:rPr>
-      </w:pPr>
-      <w:r>
-        <w:rPr>
-          <w:rFonts w:ascii="Times New Roman" w:eastAsia="Calibri" w:hAnsi="Times New Roman" w:cs="Times New Roman"/>
-          <w:sz w:val="28"/>
+        </w:rPr>
+      </w:pPr>
+      <w:r>
+        <w:rPr>
+          <w:rFonts w:asciiTheme="minorHAnsi" w:hAnsiTheme="minorHAnsi" w:cstheme="majorHAnsi"/>
+          <w:b/>
+          <w:sz w:val="32"/>
           <w:szCs w:val="28"/>
-          <w:lang w:val="de-DE" w:eastAsia="de-DE"/>
-        </w:rPr>
-        <w:t xml:space="preserve">Hiermit bestätigen wir, dass Herr/ Frau/ Familie </w:t>
-      </w:r>
-      <w:r>
-        <w:rPr>
-          <w:rFonts w:ascii="Times New Roman" w:eastAsia="Calibri" w:hAnsi="Times New Roman" w:cs="Times New Roman"/>
+        </w:rPr>
+        <w:t>München</w:t>
+      </w:r>
+      <w:r>
+        <w:rPr>
+          <w:rFonts w:asciiTheme="minorHAnsi" w:hAnsiTheme="minorHAnsi" w:cstheme="majorHAnsi"/>
           <w:b/>
-          <w:bCs/>
-          <w:sz w:val="28"/>
+          <w:sz w:val="32"/>
           <w:szCs w:val="28"/>
-          <w:lang w:val="de-DE" w:eastAsia="de-DE"/>
-        </w:rPr>
-        <w:t>{{ELTERN_NAME}}</w:t>
-      </w:r>
-      <w:r>
-        <w:rPr>
-          <w:rFonts w:ascii="Times New Roman" w:eastAsia="Calibri" w:hAnsi="Times New Roman" w:cs="Times New Roman"/>
-          <w:sz w:val="28"/>
+        </w:rPr>
+        <w:tab/>
+      </w:r>
+      <w:r>
+        <w:rPr>
+          <w:rFonts w:asciiTheme="minorHAnsi" w:hAnsiTheme="minorHAnsi" w:cstheme="majorHAnsi"/>
+          <w:b/>
+          <w:sz w:val="32"/>
           <w:szCs w:val="28"/>
-          <w:lang w:val="de-DE" w:eastAsia="de-DE"/>
-        </w:rPr>
-        <w:t xml:space="preserve"> die Unterrichtsgebühren für das Schuljahr </w:t>
-      </w:r>
-      <w:r>
-        <w:rPr>
-          <w:rFonts w:ascii="Times New Roman" w:eastAsia="Calibri" w:hAnsi="Times New Roman" w:cs="Times New Roman"/>
+        </w:rPr>
+        <w:tab/>
+      </w:r>
+      <w:r>
+        <w:rPr>
+          <w:rFonts w:asciiTheme="minorHAnsi" w:hAnsiTheme="minorHAnsi" w:cstheme="majorHAnsi"/>
           <w:b/>
-          <w:bCs/>
-          <w:sz w:val="28"/>
+          <w:sz w:val="32"/>
           <w:szCs w:val="28"/>
-          <w:lang w:val="de-DE" w:eastAsia="de-DE"/>
-        </w:rPr>
-        <w:t>{{SCHULJAHR}}</w:t>
-      </w:r>
-      <w:r>
-        <w:rPr>
-          <w:rFonts w:ascii="Times New Roman" w:eastAsia="Calibri" w:hAnsi="Times New Roman" w:cs="Times New Roman"/>
-          <w:sz w:val="28"/>
+        </w:rPr>
+        <w:tab/>
+      </w:r>
+      <w:r>
+        <w:rPr>
+          <w:rFonts w:asciiTheme="minorHAnsi" w:hAnsiTheme="minorHAnsi" w:cstheme="majorHAnsi"/>
+          <w:b/>
+          <w:sz w:val="32"/>
           <w:szCs w:val="28"/>
-          <w:lang w:val="de-DE" w:eastAsia="de-DE"/>
-        </w:rPr>
-        <w:t xml:space="preserve"> für das Kind/ die Kinder </w:t>
-      </w:r>
-      <w:r>
-        <w:rPr>
-          <w:rFonts w:ascii="Times New Roman" w:eastAsia="Calibri" w:hAnsi="Times New Roman" w:cs="Times New Roman"/>
+        </w:rPr>
+        <w:t xml:space="preserve">     </w:t>
+      </w:r>
+      <w:r>
+        <w:rPr>
+          <w:rFonts w:asciiTheme="minorHAnsi" w:hAnsiTheme="minorHAnsi" w:cstheme="majorHAnsi"/>
           <w:b/>
-          <w:bCs/>
-          <w:sz w:val="28"/>
+          <w:sz w:val="32"/>
           <w:szCs w:val="28"/>
-          <w:lang w:val="de-DE" w:eastAsia="de-DE"/>
-        </w:rPr>
-        <w:t>{{KINDER_NAMEN}}</w:t>
-      </w:r>
-      <w:r>
-        <w:rPr>
-          <w:rFonts w:ascii="Times New Roman" w:eastAsia="Calibri" w:hAnsi="Times New Roman" w:cs="Times New Roman"/>
-          <w:sz w:val="28"/>
+        </w:rPr>
+        <w:t xml:space="preserve">         </w:t>
+      </w:r>
+      <w:r>
+        <w:rPr>
+          <w:rFonts w:asciiTheme="minorHAnsi" w:hAnsiTheme="minorHAnsi" w:cstheme="majorHAnsi"/>
+          <w:b/>
+          <w:sz w:val="32"/>
           <w:szCs w:val="28"/>
-          <w:lang w:val="de-DE" w:eastAsia="de-DE"/>
-        </w:rPr>
-        <w:t xml:space="preserve"> in Höhe von </w:t>
-      </w:r>
-      <w:r>
-        <w:rPr>
-          <w:rFonts w:ascii="Times New Roman" w:eastAsia="Calibri" w:hAnsi="Times New Roman" w:cs="Times New Roman"/>
+        </w:rPr>
+        <w:t xml:space="preserve">     </w:t>
+      </w:r>
+      <w:r>
+        <w:rPr>
+          <w:rFonts w:asciiTheme="minorHAnsi" w:hAnsiTheme="minorHAnsi" w:cstheme="majorHAnsi"/>
           <w:b/>
-          <w:bCs/>
-          <w:sz w:val="28"/>
+          <w:sz w:val="32"/>
           <w:szCs w:val="28"/>
-          <w:lang w:val="de-DE" w:eastAsia="de-DE"/>
-        </w:rPr>
-        <w:t>{{BETRAG_GEBUEHR}}</w:t>
-      </w:r>
-      <w:r>
-        <w:rPr>
-          <w:rFonts w:ascii="Times New Roman" w:eastAsia="Calibri" w:hAnsi="Times New Roman" w:cs="Times New Roman"/>
-          <w:sz w:val="28"/>
+        </w:rPr>
+        <w:t xml:space="preserve">       </w:t>
+      </w:r>
+      <w:r>
+        <w:rPr>
+          <w:rFonts w:asciiTheme="minorHAnsi" w:hAnsiTheme="minorHAnsi" w:cstheme="majorHAnsi"/>
+          <w:b/>
+          <w:sz w:val="32"/>
           <w:szCs w:val="28"/>
-          <w:lang w:val="de-DE" w:eastAsia="de-DE"/>
         </w:rPr>
         <w:t xml:space="preserve"> </w:t>
       </w:r>
       <w:r>
         <w:rPr>
-          <w:rFonts w:ascii="Times New Roman" w:eastAsia="Calibri" w:hAnsi="Times New Roman" w:cs="Times New Roman"/>
-          <w:sz w:val="28"/>
-          <w:szCs w:val="28"/>
-          <w:lang w:val="de-DE" w:eastAsia="de-DE"/>
-        </w:rPr>
-        <w:t>(</w:t>
-      </w:r>
-      <w:r>
-        <w:rPr>
-          <w:rFonts w:ascii="Times New Roman" w:eastAsia="Calibri" w:hAnsi="Times New Roman" w:cs="Times New Roman"/>
-          <w:sz w:val="28"/>
-          <w:szCs w:val="28"/>
-          <w:lang w:val="de-DE" w:eastAsia="de-DE"/>
-        </w:rPr>
-        <w:t>{{BETRAG_GEBUEHR_WORT}}</w:t>
-      </w:r>
-      <w:r>
-        <w:rPr>
-          <w:rFonts w:ascii="Times New Roman" w:eastAsia="Calibri" w:hAnsi="Times New Roman" w:cs="Times New Roman"/>
-          <w:sz w:val="28"/>
-          <w:szCs w:val="28"/>
-          <w:lang w:val="de-DE" w:eastAsia="de-DE"/>
-        </w:rPr>
-        <w:t>)</w:t>
-      </w:r>
-      <w:r>
-        <w:rPr>
-          <w:rFonts w:ascii="Times New Roman" w:eastAsia="Calibri" w:hAnsi="Times New Roman" w:cs="Times New Roman"/>
-          <w:sz w:val="28"/>
-          <w:szCs w:val="28"/>
-          <w:lang w:val="de-DE" w:eastAsia="de-DE"/>
-        </w:rPr>
-        <w:t xml:space="preserve"> und den Mitgliedsbeitrag in Höhe von </w:t>
-      </w:r>
-      <w:r>
-        <w:rPr>
-          <w:rFonts w:ascii="Times New Roman" w:eastAsia="Calibri" w:hAnsi="Times New Roman" w:cs="Times New Roman"/>
-          <w:b/>
-          <w:bCs/>
-          <w:sz w:val="28"/>
-          <w:szCs w:val="28"/>
-          <w:lang w:val="de-DE" w:eastAsia="de-DE"/>
-        </w:rPr>
-        <w:t>{{BETRAG_MITGLIED}}</w:t>
-      </w:r>
-      <w:r>
-        <w:rPr>
-          <w:rFonts w:ascii="Times New Roman" w:eastAsia="Calibri" w:hAnsi="Times New Roman" w:cs="Times New Roman"/>
-          <w:sz w:val="28"/>
-          <w:szCs w:val="28"/>
-          <w:lang w:val="de-DE" w:eastAsia="de-DE"/>
-        </w:rPr>
-        <w:t xml:space="preserve"> </w:t>
-      </w:r>
-      <w:r>
-        <w:rPr>
-          <w:rFonts w:ascii="Times New Roman" w:eastAsia="Calibri" w:hAnsi="Times New Roman" w:cs="Times New Roman"/>
-          <w:sz w:val="28"/>
-          <w:szCs w:val="28"/>
-          <w:lang w:val="de-DE" w:eastAsia="de-DE"/>
-        </w:rPr>
-        <w:t>(</w:t>
-      </w:r>
-      <w:r>
-        <w:rPr>
-          <w:rFonts w:ascii="Times New Roman" w:eastAsia="Calibri" w:hAnsi="Times New Roman" w:cs="Times New Roman"/>
-          <w:sz w:val="28"/>
-          <w:szCs w:val="28"/>
-          <w:lang w:val="de-DE" w:eastAsia="de-DE"/>
-        </w:rPr>
-        <w:t>{{BETRAG_MITGLIED_WORT}}</w:t>
-      </w:r>
-      <w:r>
-        <w:rPr>
-          <w:rFonts w:ascii="Times New Roman" w:eastAsia="Calibri" w:hAnsi="Times New Roman" w:cs="Times New Roman"/>
-          <w:sz w:val="28"/>
-          <w:szCs w:val="28"/>
-          <w:lang w:val="de-DE" w:eastAsia="de-DE"/>
-        </w:rPr>
-        <w:t xml:space="preserve">) </w:t>
-      </w:r>
-      <w:r>
-        <w:rPr>
-          <w:rFonts w:ascii="Times New Roman" w:eastAsia="Calibri" w:hAnsi="Times New Roman" w:cs="Times New Roman"/>
-          <w:sz w:val="28"/>
-          <w:szCs w:val="28"/>
-          <w:lang w:val="de-DE" w:eastAsia="de-DE"/>
-        </w:rPr>
-        <w:t>bezahlt hat.</w:t>
-      </w:r>
-    </w:p>
-    <w:p>
-      <w:pPr>
-        <w:pStyle w:val="KeinLeerraum"/>
-        <w:jc w:val="both"/>
-        <w:rPr>
-          <w:rFonts w:ascii="Times New Roman" w:eastAsia="Calibri" w:hAnsi="Times New Roman" w:cs="Times New Roman"/>
-          <w:sz w:val="28"/>
-          <w:szCs w:val="28"/>
-          <w:lang w:val="de-DE" w:eastAsia="de-DE"/>
-        </w:rPr>
-      </w:pPr>
-    </w:p>
-    <w:p>
-      <w:pPr>
-        <w:pStyle w:val="KeinLeerraum"/>
-        <w:jc w:val="both"/>
-        <w:rPr>
-          <w:rFonts w:ascii="Times New Roman" w:hAnsi="Times New Roman" w:cs="Times New Roman"/>
-          <w:sz w:val="28"/>
-          <w:szCs w:val="28"/>
-          <w:lang w:val="de-DE"/>
-        </w:rPr>
-      </w:pPr>
-      <w:r>
-        <w:rPr>
-          <w:rFonts w:ascii="Times New Roman" w:eastAsia="Calibri" w:hAnsi="Times New Roman" w:cs="Times New Roman"/>
-          <w:sz w:val="28"/>
-          <w:szCs w:val="28"/>
-          <w:lang w:val="de-DE" w:eastAsia="de-DE"/>
-        </w:rPr>
-        <w:t xml:space="preserve">Gesamtbetrag: </w:t>
-      </w:r>
-      <w:r>
-        <w:rPr>
-          <w:rFonts w:ascii="Times New Roman" w:eastAsia="Calibri" w:hAnsi="Times New Roman" w:cs="Times New Roman"/>
-          <w:b/>
-          <w:bCs/>
-          <w:sz w:val="28"/>
-          <w:szCs w:val="28"/>
-          <w:lang w:val="de-DE" w:eastAsia="de-DE"/>
-        </w:rPr>
-        <w:t>{{GESAMTBETRAG}}</w:t>
-      </w:r>
-      <w:r>
-        <w:rPr>
-          <w:rFonts w:ascii="Times New Roman" w:eastAsia="Calibri" w:hAnsi="Times New Roman" w:cs="Times New Roman"/>
-          <w:sz w:val="28"/>
-          <w:szCs w:val="28"/>
-          <w:lang w:val="de-DE" w:eastAsia="de-DE"/>
-        </w:rPr>
-        <w:t xml:space="preserve"> </w:t>
-      </w:r>
-      <w:r>
-        <w:rPr>
-          <w:rFonts w:ascii="Times New Roman" w:eastAsia="Calibri" w:hAnsi="Times New Roman" w:cs="Times New Roman"/>
-          <w:sz w:val="28"/>
-          <w:szCs w:val="28"/>
-          <w:lang w:val="de-DE" w:eastAsia="de-DE"/>
-        </w:rPr>
-        <w:t>(</w:t>
-      </w:r>
-      <w:r>
-        <w:rPr>
-          <w:rFonts w:ascii="Times New Roman" w:eastAsia="Calibri" w:hAnsi="Times New Roman" w:cs="Times New Roman"/>
-          <w:sz w:val="28"/>
-          <w:szCs w:val="28"/>
-          <w:lang w:val="de-DE" w:eastAsia="de-DE"/>
-        </w:rPr>
-        <w:t>{{GESAMTBETRAG_WORT}}</w:t>
-      </w:r>
-      <w:r>
-        <w:rPr>
-          <w:rFonts w:ascii="Times New Roman" w:eastAsia="Calibri" w:hAnsi="Times New Roman" w:cs="Times New Roman"/>
-          <w:sz w:val="28"/>
-          <w:szCs w:val="28"/>
-          <w:lang w:val="de-DE" w:eastAsia="de-DE"/>
-        </w:rPr>
-        <w:t>)</w:t>
-      </w:r>
-    </w:p>
-    <w:p>
-      <w:pPr>
-        <w:pStyle w:val="KeinLeerraum"/>
-        <w:jc w:val="both"/>
-        <w:rPr>
-          <w:rFonts w:ascii="Times New Roman" w:hAnsi="Times New Roman" w:cs="Times New Roman"/>
-          <w:sz w:val="28"/>
-          <w:szCs w:val="28"/>
-        </w:rPr>
-      </w:pPr>
-      <w:r>
-        <w:rPr>
-          <w:rFonts w:ascii="Times New Roman" w:hAnsi="Times New Roman" w:cs="Times New Roman"/>
-          <w:sz w:val="28"/>
-          <w:szCs w:val="28"/>
-        </w:rPr>
-        <w:t xml:space="preserve"> </w:t>
-      </w:r>
-    </w:p>
-    <w:p>
-      <w:pPr>
-        <w:pStyle w:val="KeinLeerraum"/>
-        <w:rPr>
-          <w:rFonts w:ascii="Times New Roman" w:hAnsi="Times New Roman" w:cs="Times New Roman"/>
-          <w:sz w:val="28"/>
-          <w:szCs w:val="28"/>
-        </w:rPr>
-      </w:pPr>
-    </w:p>
-    <w:p>
-      <w:pPr>
-        <w:pStyle w:val="KeinLeerraum"/>
-        <w:rPr>
-          <w:rFonts w:ascii="Times New Roman" w:hAnsi="Times New Roman" w:cs="Times New Roman"/>
-          <w:sz w:val="28"/>
-          <w:szCs w:val="28"/>
-        </w:rPr>
-      </w:pPr>
-      <w:r>
-        <w:rPr>
-          <w:rFonts w:ascii="Times New Roman" w:hAnsi="Times New Roman" w:cs="Times New Roman"/>
-          <w:sz w:val="28"/>
-          <w:szCs w:val="28"/>
-        </w:rPr>
-        <w:tab/>
-        <w:t xml:space="preserve"> </w:t>
-      </w:r>
-    </w:p>
-    <w:p>
-      <w:pPr>
-        <w:jc w:val="center"/>
-        <w:outlineLvl w:val="0"/>
-        <w:rPr>
-          <w:rFonts w:ascii="Times New Roman" w:hAnsi="Times New Roman" w:cs="Times New Roman"/>
+          <w:rFonts w:asciiTheme="minorHAnsi" w:hAnsiTheme="minorHAnsi" w:cstheme="majorHAnsi"/>
           <w:b/>
           <w:sz w:val="28"/>
           <w:szCs w:val="28"/>
         </w:rPr>
-      </w:pPr>
-      <w:r>
-        <w:rPr>
-          <w:rFonts w:ascii="Times New Roman" w:hAnsi="Times New Roman" w:cs="Times New Roman"/>
-          <w:sz w:val="28"/>
-          <w:szCs w:val="28"/>
-        </w:rPr>
-        <w:t>{{DATUM}}</w:t>
-      </w:r>
-      <w:r>
-        <w:rPr>
-          <w:rFonts w:ascii="Times New Roman" w:hAnsi="Times New Roman" w:cs="Times New Roman"/>
-          <w:sz w:val="28"/>
-          <w:szCs w:val="28"/>
-        </w:rPr>
-        <w:t xml:space="preserve"> г.</w:t>
-      </w:r>
-      <w:r>
-        <w:rPr>
-          <w:rFonts w:ascii="Times New Roman" w:hAnsi="Times New Roman" w:cs="Times New Roman"/>
-          <w:sz w:val="28"/>
-          <w:szCs w:val="28"/>
-        </w:rPr>
-        <w:tab/>
-      </w:r>
-      <w:r>
-        <w:rPr>
-          <w:rFonts w:ascii="Times New Roman" w:hAnsi="Times New Roman" w:cs="Times New Roman"/>
-          <w:sz w:val="28"/>
-          <w:szCs w:val="28"/>
-        </w:rPr>
-        <w:tab/>
-      </w:r>
-      <w:r>
-        <w:rPr>
-          <w:rFonts w:ascii="Times New Roman" w:hAnsi="Times New Roman" w:cs="Times New Roman"/>
-          <w:sz w:val="28"/>
-          <w:szCs w:val="28"/>
-        </w:rPr>
-        <w:tab/>
-      </w:r>
-      <w:r>
-        <w:rPr>
-          <w:rFonts w:ascii="Times New Roman" w:hAnsi="Times New Roman" w:cs="Times New Roman"/>
+        <w:t xml:space="preserve">/ </w:t>
+      </w:r>
+      <w:proofErr w:type="spellStart"/>
+      <w:r>
+        <w:rPr>
+          <w:rFonts w:asciiTheme="minorHAnsi" w:hAnsiTheme="minorHAnsi" w:cstheme="majorHAnsi"/>
           <w:b/>
           <w:sz w:val="28"/>
           <w:szCs w:val="28"/>
         </w:rPr>
-        <w:t>Unterschrift: …………………………………</w:t>
-      </w:r>
-    </w:p>
-    <w:p>
-      <w:pPr>
-        <w:jc w:val="right"/>
-        <w:rPr>
-          <w:rFonts w:ascii="Times New Roman" w:hAnsi="Times New Roman" w:cs="Times New Roman"/>
+        <w:t>Aglika</w:t>
+      </w:r>
+      <w:proofErr w:type="spellEnd"/>
+      <w:r>
+        <w:rPr>
+          <w:rFonts w:asciiTheme="minorHAnsi" w:hAnsiTheme="minorHAnsi" w:cstheme="majorHAnsi"/>
           <w:b/>
           <w:sz w:val="28"/>
           <w:szCs w:val="28"/>
         </w:rPr>
-      </w:pPr>
-      <w:r>
-        <w:rPr>
-          <w:rFonts w:ascii="Times New Roman" w:hAnsi="Times New Roman" w:cs="Times New Roman"/>
+        <w:t xml:space="preserve"> </w:t>
+      </w:r>
+      <w:proofErr w:type="spellStart"/>
+      <w:r>
+        <w:rPr>
+          <w:rFonts w:asciiTheme="minorHAnsi" w:hAnsiTheme="minorHAnsi" w:cstheme="majorHAnsi"/>
           <w:b/>
           <w:sz w:val="28"/>
           <w:szCs w:val="28"/>
         </w:rPr>
-        <w:tab/>
-      </w:r>
-      <w:r>
-        <w:rPr>
-          <w:rFonts w:ascii="Times New Roman" w:hAnsi="Times New Roman" w:cs="Times New Roman"/>
+        <w:t>Krasteva-Dimitrova</w:t>
+      </w:r>
+      <w:proofErr w:type="spellEnd"/>
+      <w:r>
+        <w:rPr>
+          <w:rFonts w:asciiTheme="minorHAnsi" w:hAnsiTheme="minorHAnsi" w:cstheme="majorHAnsi"/>
           <w:b/>
           <w:sz w:val="28"/>
           <w:szCs w:val="28"/>
         </w:rPr>
-        <w:tab/>
-        <w:t xml:space="preserve">/ </w:t>
-      </w:r>
-      <w:r>
-        <w:rPr>
-          <w:rFonts w:ascii="Times New Roman" w:hAnsi="Times New Roman" w:cs="Times New Roman"/>
-          <w:b/>
-          <w:sz w:val="28"/>
-          <w:szCs w:val="28"/>
-        </w:rPr>
-        <w:t xml:space="preserve">Name </w:t>
-      </w:r>
-      <w:r>
-        <w:rPr>
-          <w:rFonts w:ascii="Times New Roman" w:hAnsi="Times New Roman" w:cs="Times New Roman"/>
-          <w:b/>
-          <w:sz w:val="28"/>
-          <w:szCs w:val="28"/>
-        </w:rPr>
-        <w:t>&lt;Name&gt;</w:t>
-      </w:r>
-      <w:r>
-        <w:rPr>
-          <w:rFonts w:ascii="Times New Roman" w:hAnsi="Times New Roman" w:cs="Times New Roman"/>
-          <w:b/>
-          <w:sz w:val="28"/>
-          <w:szCs w:val="28"/>
-        </w:rPr>
-        <w:t>, Vorsitzender/</w:t>
+        <w:t>/</w:t>
       </w:r>
     </w:p>
     <w:p>
       <w:pPr>
         <w:pStyle w:val="KeinLeerraum"/>
         <w:rPr>
-          <w:sz w:val="28"/>
+          <w:rFonts w:cstheme="majorHAnsi"/>
+          <w:sz w:val="32"/>
         </w:rPr>
       </w:pPr>
     </w:p>
@@ -551,7 +622,7 @@
 </file>
 
 <file path=word/endnotes.xml><?xml version="1.0" encoding="utf-8"?>
-<w:endnotes xmlns:wpc="http://schemas.microsoft.com/office/word/2010/wordprocessingCanvas" xmlns:cx="http://schemas.microsoft.com/office/drawing/2014/chartex" xmlns:cx1="http://schemas.microsoft.com/office/drawing/2015/9/8/chartex" xmlns:cx2="http://schemas.microsoft.com/office/drawing/2015/10/21/chartex" xmlns:cx3="http://schemas.microsoft.com/office/drawing/2016/5/9/chartex" xmlns:cx4="http://schemas.microsoft.com/office/drawing/2016/5/10/chartex" xmlns:cx5="http://schemas.microsoft.com/office/drawing/2016/5/11/chartex" xmlns:cx6="http://schemas.microsoft.com/office/drawing/2016/5/12/chartex" xmlns:cx7="http://schemas.microsoft.com/office/drawing/2016/5/13/chartex" xmlns:cx8="http://schemas.microsoft.com/office/drawing/2016/5/14/chartex" xmlns:mc="http://schemas.openxmlformats.org/markup-compatibility/2006" xmlns:aink="http://schemas.microsoft.com/office/drawing/2016/ink" xmlns:am3d="http://schemas.microsoft.com/office/drawing/2017/model3d" xmlns:o="urn:schemas-microsoft-com:office:office" xmlns:r="http://schemas.openxmlformats.org/officeDocument/2006/relationships" xmlns:m="http://schemas.openxmlformats.org/officeDocument/2006/math" xmlns:v="urn:schemas-microsoft-com:vml" xmlns:wp14="http://schemas.microsoft.com/office/word/2010/wordprocessingDrawing" xmlns:wp="http://schemas.openxmlformats.org/drawingml/2006/wordprocessingDrawing" xmlns:w10="urn:schemas-microsoft-com:office:word" xmlns:w="http://schemas.openxmlformats.org/wordprocessingml/2006/main" xmlns:w14="http://schemas.microsoft.com/office/word/2010/wordml" xmlns:w15="http://schemas.microsoft.com/office/word/2012/wordml" xmlns:w16cex="http://schemas.microsoft.com/office/word/2018/wordml/cex" xmlns:w16cid="http://schemas.microsoft.com/office/word/2016/wordml/cid" xmlns:w16="http://schemas.microsoft.com/office/word/2018/wordml" xmlns:w16sdtdh="http://schemas.microsoft.com/office/word/2020/wordml/sdtdatahash" xmlns:w16se="http://schemas.microsoft.com/office/word/2015/wordml/symex" xmlns:wpg="http://schemas.microsoft.com/office/word/2010/wordprocessingGroup" xmlns:wpi="http://schemas.microsoft.com/office/word/2010/wordprocessingInk" xmlns:wne="http://schemas.microsoft.com/office/word/2006/wordml" xmlns:wps="http://schemas.microsoft.com/office/word/2010/wordprocessingShape" mc:Ignorable="w14 w15 w16se w16cid w16 w16cex w16sdtdh wp14">
+<w:endnotes xmlns:wpc="http://schemas.microsoft.com/office/word/2010/wordprocessingCanvas" xmlns:cx="http://schemas.microsoft.com/office/drawing/2014/chartex" xmlns:cx1="http://schemas.microsoft.com/office/drawing/2015/9/8/chartex" xmlns:cx2="http://schemas.microsoft.com/office/drawing/2015/10/21/chartex" xmlns:cx3="http://schemas.microsoft.com/office/drawing/2016/5/9/chartex" xmlns:cx4="http://schemas.microsoft.com/office/drawing/2016/5/10/chartex" xmlns:cx5="http://schemas.microsoft.com/office/drawing/2016/5/11/chartex" xmlns:cx6="http://schemas.microsoft.com/office/drawing/2016/5/12/chartex" xmlns:cx7="http://schemas.microsoft.com/office/drawing/2016/5/13/chartex" xmlns:cx8="http://schemas.microsoft.com/office/drawing/2016/5/14/chartex" xmlns:mc="http://schemas.openxmlformats.org/markup-compatibility/2006" xmlns:aink="http://schemas.microsoft.com/office/drawing/2016/ink" xmlns:am3d="http://schemas.microsoft.com/office/drawing/2017/model3d" xmlns:o="urn:schemas-microsoft-com:office:office" xmlns:r="http://schemas.openxmlformats.org/officeDocument/2006/relationships" xmlns:m="http://schemas.openxmlformats.org/officeDocument/2006/math" xmlns:v="urn:schemas-microsoft-com:vml" xmlns:wp14="http://schemas.microsoft.com/office/word/2010/wordprocessingDrawing" xmlns:wp="http://schemas.openxmlformats.org/drawingml/2006/wordprocessingDrawing" xmlns:w10="urn:schemas-microsoft-com:office:word" xmlns:w="http://schemas.openxmlformats.org/wordprocessingml/2006/main" xmlns:w14="http://schemas.microsoft.com/office/word/2010/wordml" xmlns:w15="http://schemas.microsoft.com/office/word/2012/wordml" xmlns:w16cid="http://schemas.microsoft.com/office/word/2016/wordml/cid" xmlns:w16se="http://schemas.microsoft.com/office/word/2015/wordml/symex" xmlns:wpg="http://schemas.microsoft.com/office/word/2010/wordprocessingGroup" xmlns:wpi="http://schemas.microsoft.com/office/word/2010/wordprocessingInk" xmlns:wne="http://schemas.microsoft.com/office/word/2006/wordml" xmlns:wps="http://schemas.microsoft.com/office/word/2010/wordprocessingShape" mc:Ignorable="w14 w15 w16se w16cid wp14">
   <w:endnote w:type="separator" w:id="-1">
     <w:p>
       <w:pPr>
@@ -576,7 +647,7 @@
 </file>
 
 <file path=word/footer1.xml><?xml version="1.0" encoding="utf-8"?>
-<w:ftr xmlns:wpc="http://schemas.microsoft.com/office/word/2010/wordprocessingCanvas" xmlns:cx="http://schemas.microsoft.com/office/drawing/2014/chartex" xmlns:cx1="http://schemas.microsoft.com/office/drawing/2015/9/8/chartex" xmlns:cx2="http://schemas.microsoft.com/office/drawing/2015/10/21/chartex" xmlns:cx3="http://schemas.microsoft.com/office/drawing/2016/5/9/chartex" xmlns:cx4="http://schemas.microsoft.com/office/drawing/2016/5/10/chartex" xmlns:cx5="http://schemas.microsoft.com/office/drawing/2016/5/11/chartex" xmlns:cx6="http://schemas.microsoft.com/office/drawing/2016/5/12/chartex" xmlns:cx7="http://schemas.microsoft.com/office/drawing/2016/5/13/chartex" xmlns:cx8="http://schemas.microsoft.com/office/drawing/2016/5/14/chartex" xmlns:mc="http://schemas.openxmlformats.org/markup-compatibility/2006" xmlns:aink="http://schemas.microsoft.com/office/drawing/2016/ink" xmlns:am3d="http://schemas.microsoft.com/office/drawing/2017/model3d" xmlns:o="urn:schemas-microsoft-com:office:office" xmlns:r="http://schemas.openxmlformats.org/officeDocument/2006/relationships" xmlns:m="http://schemas.openxmlformats.org/officeDocument/2006/math" xmlns:v="urn:schemas-microsoft-com:vml" xmlns:wp14="http://schemas.microsoft.com/office/word/2010/wordprocessingDrawing" xmlns:wp="http://schemas.openxmlformats.org/drawingml/2006/wordprocessingDrawing" xmlns:w10="urn:schemas-microsoft-com:office:word" xmlns:w="http://schemas.openxmlformats.org/wordprocessingml/2006/main" xmlns:w14="http://schemas.microsoft.com/office/word/2010/wordml" xmlns:w15="http://schemas.microsoft.com/office/word/2012/wordml" xmlns:w16cex="http://schemas.microsoft.com/office/word/2018/wordml/cex" xmlns:w16cid="http://schemas.microsoft.com/office/word/2016/wordml/cid" xmlns:w16="http://schemas.microsoft.com/office/word/2018/wordml" xmlns:w16sdtdh="http://schemas.microsoft.com/office/word/2020/wordml/sdtdatahash" xmlns:w16se="http://schemas.microsoft.com/office/word/2015/wordml/symex" xmlns:wpg="http://schemas.microsoft.com/office/word/2010/wordprocessingGroup" xmlns:wpi="http://schemas.microsoft.com/office/word/2010/wordprocessingInk" xmlns:wne="http://schemas.microsoft.com/office/word/2006/wordml" xmlns:wps="http://schemas.microsoft.com/office/word/2010/wordprocessingShape" mc:Ignorable="w14 w15 w16se w16cid w16 w16cex w16sdtdh wp14">
+<w:ftr xmlns:wpc="http://schemas.microsoft.com/office/word/2010/wordprocessingCanvas" xmlns:cx="http://schemas.microsoft.com/office/drawing/2014/chartex" xmlns:cx1="http://schemas.microsoft.com/office/drawing/2015/9/8/chartex" xmlns:cx2="http://schemas.microsoft.com/office/drawing/2015/10/21/chartex" xmlns:cx3="http://schemas.microsoft.com/office/drawing/2016/5/9/chartex" xmlns:cx4="http://schemas.microsoft.com/office/drawing/2016/5/10/chartex" xmlns:cx5="http://schemas.microsoft.com/office/drawing/2016/5/11/chartex" xmlns:cx6="http://schemas.microsoft.com/office/drawing/2016/5/12/chartex" xmlns:cx7="http://schemas.microsoft.com/office/drawing/2016/5/13/chartex" xmlns:cx8="http://schemas.microsoft.com/office/drawing/2016/5/14/chartex" xmlns:mc="http://schemas.openxmlformats.org/markup-compatibility/2006" xmlns:aink="http://schemas.microsoft.com/office/drawing/2016/ink" xmlns:am3d="http://schemas.microsoft.com/office/drawing/2017/model3d" xmlns:o="urn:schemas-microsoft-com:office:office" xmlns:r="http://schemas.openxmlformats.org/officeDocument/2006/relationships" xmlns:m="http://schemas.openxmlformats.org/officeDocument/2006/math" xmlns:v="urn:schemas-microsoft-com:vml" xmlns:wp14="http://schemas.microsoft.com/office/word/2010/wordprocessingDrawing" xmlns:wp="http://schemas.openxmlformats.org/drawingml/2006/wordprocessingDrawing" xmlns:w10="urn:schemas-microsoft-com:office:word" xmlns:w="http://schemas.openxmlformats.org/wordprocessingml/2006/main" xmlns:w14="http://schemas.microsoft.com/office/word/2010/wordml" xmlns:w15="http://schemas.microsoft.com/office/word/2012/wordml" xmlns:w16cid="http://schemas.microsoft.com/office/word/2016/wordml/cid" xmlns:w16se="http://schemas.microsoft.com/office/word/2015/wordml/symex" xmlns:wpg="http://schemas.microsoft.com/office/word/2010/wordprocessingGroup" xmlns:wpi="http://schemas.microsoft.com/office/word/2010/wordprocessingInk" xmlns:wne="http://schemas.microsoft.com/office/word/2006/wordml" xmlns:wps="http://schemas.microsoft.com/office/word/2010/wordprocessingShape" mc:Ignorable="w14 w15 w16se w16cid wp14">
   <w:p>
     <w:pPr>
       <w:pBdr>
@@ -660,6 +731,7 @@
             </w:rPr>
             <w:t>„</w:t>
           </w:r>
+          <w:proofErr w:type="spellStart"/>
           <w:r>
             <w:rPr>
               <w:b/>
@@ -667,8 +739,29 @@
               <w:sz w:val="16"/>
               <w:szCs w:val="16"/>
             </w:rPr>
-            <w:t>Paisii Hilendarski</w:t>
+            <w:t>Paisii</w:t>
           </w:r>
+          <w:proofErr w:type="spellEnd"/>
+          <w:r>
+            <w:rPr>
+              <w:b/>
+              <w:bCs/>
+              <w:sz w:val="16"/>
+              <w:szCs w:val="16"/>
+            </w:rPr>
+            <w:t xml:space="preserve"> </w:t>
+          </w:r>
+          <w:proofErr w:type="spellStart"/>
+          <w:r>
+            <w:rPr>
+              <w:b/>
+              <w:bCs/>
+              <w:sz w:val="16"/>
+              <w:szCs w:val="16"/>
+            </w:rPr>
+            <w:t>Hilendarski</w:t>
+          </w:r>
+          <w:proofErr w:type="spellEnd"/>
           <w:r>
             <w:rPr>
               <w:b/>
@@ -879,7 +972,7 @@
 </file>
 
 <file path=word/footnotes.xml><?xml version="1.0" encoding="utf-8"?>
-<w:footnotes xmlns:wpc="http://schemas.microsoft.com/office/word/2010/wordprocessingCanvas" xmlns:cx="http://schemas.microsoft.com/office/drawing/2014/chartex" xmlns:cx1="http://schemas.microsoft.com/office/drawing/2015/9/8/chartex" xmlns:cx2="http://schemas.microsoft.com/office/drawing/2015/10/21/chartex" xmlns:cx3="http://schemas.microsoft.com/office/drawing/2016/5/9/chartex" xmlns:cx4="http://schemas.microsoft.com/office/drawing/2016/5/10/chartex" xmlns:cx5="http://schemas.microsoft.com/office/drawing/2016/5/11/chartex" xmlns:cx6="http://schemas.microsoft.com/office/drawing/2016/5/12/chartex" xmlns:cx7="http://schemas.microsoft.com/office/drawing/2016/5/13/chartex" xmlns:cx8="http://schemas.microsoft.com/office/drawing/2016/5/14/chartex" xmlns:mc="http://schemas.openxmlformats.org/markup-compatibility/2006" xmlns:aink="http://schemas.microsoft.com/office/drawing/2016/ink" xmlns:am3d="http://schemas.microsoft.com/office/drawing/2017/model3d" xmlns:o="urn:schemas-microsoft-com:office:office" xmlns:r="http://schemas.openxmlformats.org/officeDocument/2006/relationships" xmlns:m="http://schemas.openxmlformats.org/officeDocument/2006/math" xmlns:v="urn:schemas-microsoft-com:vml" xmlns:wp14="http://schemas.microsoft.com/office/word/2010/wordprocessingDrawing" xmlns:wp="http://schemas.openxmlformats.org/drawingml/2006/wordprocessingDrawing" xmlns:w10="urn:schemas-microsoft-com:office:word" xmlns:w="http://schemas.openxmlformats.org/wordprocessingml/2006/main" xmlns:w14="http://schemas.microsoft.com/office/word/2010/wordml" xmlns:w15="http://schemas.microsoft.com/office/word/2012/wordml" xmlns:w16cex="http://schemas.microsoft.com/office/word/2018/wordml/cex" xmlns:w16cid="http://schemas.microsoft.com/office/word/2016/wordml/cid" xmlns:w16="http://schemas.microsoft.com/office/word/2018/wordml" xmlns:w16sdtdh="http://schemas.microsoft.com/office/word/2020/wordml/sdtdatahash" xmlns:w16se="http://schemas.microsoft.com/office/word/2015/wordml/symex" xmlns:wpg="http://schemas.microsoft.com/office/word/2010/wordprocessingGroup" xmlns:wpi="http://schemas.microsoft.com/office/word/2010/wordprocessingInk" xmlns:wne="http://schemas.microsoft.com/office/word/2006/wordml" xmlns:wps="http://schemas.microsoft.com/office/word/2010/wordprocessingShape" mc:Ignorable="w14 w15 w16se w16cid w16 w16cex w16sdtdh wp14">
+<w:footnotes xmlns:wpc="http://schemas.microsoft.com/office/word/2010/wordprocessingCanvas" xmlns:cx="http://schemas.microsoft.com/office/drawing/2014/chartex" xmlns:cx1="http://schemas.microsoft.com/office/drawing/2015/9/8/chartex" xmlns:cx2="http://schemas.microsoft.com/office/drawing/2015/10/21/chartex" xmlns:cx3="http://schemas.microsoft.com/office/drawing/2016/5/9/chartex" xmlns:cx4="http://schemas.microsoft.com/office/drawing/2016/5/10/chartex" xmlns:cx5="http://schemas.microsoft.com/office/drawing/2016/5/11/chartex" xmlns:cx6="http://schemas.microsoft.com/office/drawing/2016/5/12/chartex" xmlns:cx7="http://schemas.microsoft.com/office/drawing/2016/5/13/chartex" xmlns:cx8="http://schemas.microsoft.com/office/drawing/2016/5/14/chartex" xmlns:mc="http://schemas.openxmlformats.org/markup-compatibility/2006" xmlns:aink="http://schemas.microsoft.com/office/drawing/2016/ink" xmlns:am3d="http://schemas.microsoft.com/office/drawing/2017/model3d" xmlns:o="urn:schemas-microsoft-com:office:office" xmlns:r="http://schemas.openxmlformats.org/officeDocument/2006/relationships" xmlns:m="http://schemas.openxmlformats.org/officeDocument/2006/math" xmlns:v="urn:schemas-microsoft-com:vml" xmlns:wp14="http://schemas.microsoft.com/office/word/2010/wordprocessingDrawing" xmlns:wp="http://schemas.openxmlformats.org/drawingml/2006/wordprocessingDrawing" xmlns:w10="urn:schemas-microsoft-com:office:word" xmlns:w="http://schemas.openxmlformats.org/wordprocessingml/2006/main" xmlns:w14="http://schemas.microsoft.com/office/word/2010/wordml" xmlns:w15="http://schemas.microsoft.com/office/word/2012/wordml" xmlns:w16cid="http://schemas.microsoft.com/office/word/2016/wordml/cid" xmlns:w16se="http://schemas.microsoft.com/office/word/2015/wordml/symex" xmlns:wpg="http://schemas.microsoft.com/office/word/2010/wordprocessingGroup" xmlns:wpi="http://schemas.microsoft.com/office/word/2010/wordprocessingInk" xmlns:wne="http://schemas.microsoft.com/office/word/2006/wordml" xmlns:wps="http://schemas.microsoft.com/office/word/2010/wordprocessingShape" mc:Ignorable="w14 w15 w16se w16cid wp14">
   <w:footnote w:type="separator" w:id="-1">
     <w:p>
       <w:pPr>
@@ -904,7 +997,7 @@
 </file>
 
 <file path=word/header1.xml><?xml version="1.0" encoding="utf-8"?>
-<w:hdr xmlns:wpc="http://schemas.microsoft.com/office/word/2010/wordprocessingCanvas" xmlns:cx="http://schemas.microsoft.com/office/drawing/2014/chartex" xmlns:cx1="http://schemas.microsoft.com/office/drawing/2015/9/8/chartex" xmlns:cx2="http://schemas.microsoft.com/office/drawing/2015/10/21/chartex" xmlns:cx3="http://schemas.microsoft.com/office/drawing/2016/5/9/chartex" xmlns:cx4="http://schemas.microsoft.com/office/drawing/2016/5/10/chartex" xmlns:cx5="http://schemas.microsoft.com/office/drawing/2016/5/11/chartex" xmlns:cx6="http://schemas.microsoft.com/office/drawing/2016/5/12/chartex" xmlns:cx7="http://schemas.microsoft.com/office/drawing/2016/5/13/chartex" xmlns:cx8="http://schemas.microsoft.com/office/drawing/2016/5/14/chartex" xmlns:mc="http://schemas.openxmlformats.org/markup-compatibility/2006" xmlns:aink="http://schemas.microsoft.com/office/drawing/2016/ink" xmlns:am3d="http://schemas.microsoft.com/office/drawing/2017/model3d" xmlns:o="urn:schemas-microsoft-com:office:office" xmlns:r="http://schemas.openxmlformats.org/officeDocument/2006/relationships" xmlns:m="http://schemas.openxmlformats.org/officeDocument/2006/math" xmlns:v="urn:schemas-microsoft-com:vml" xmlns:wp14="http://schemas.microsoft.com/office/word/2010/wordprocessingDrawing" xmlns:wp="http://schemas.openxmlformats.org/drawingml/2006/wordprocessingDrawing" xmlns:w10="urn:schemas-microsoft-com:office:word" xmlns:w="http://schemas.openxmlformats.org/wordprocessingml/2006/main" xmlns:w14="http://schemas.microsoft.com/office/word/2010/wordml" xmlns:w15="http://schemas.microsoft.com/office/word/2012/wordml" xmlns:w16cex="http://schemas.microsoft.com/office/word/2018/wordml/cex" xmlns:w16cid="http://schemas.microsoft.com/office/word/2016/wordml/cid" xmlns:w16="http://schemas.microsoft.com/office/word/2018/wordml" xmlns:w16sdtdh="http://schemas.microsoft.com/office/word/2020/wordml/sdtdatahash" xmlns:w16se="http://schemas.microsoft.com/office/word/2015/wordml/symex" xmlns:wpg="http://schemas.microsoft.com/office/word/2010/wordprocessingGroup" xmlns:wpi="http://schemas.microsoft.com/office/word/2010/wordprocessingInk" xmlns:wne="http://schemas.microsoft.com/office/word/2006/wordml" xmlns:wps="http://schemas.microsoft.com/office/word/2010/wordprocessingShape" mc:Ignorable="w14 w15 w16se w16cid w16 w16cex w16sdtdh wp14">
+<w:hdr xmlns:wpc="http://schemas.microsoft.com/office/word/2010/wordprocessingCanvas" xmlns:cx="http://schemas.microsoft.com/office/drawing/2014/chartex" xmlns:cx1="http://schemas.microsoft.com/office/drawing/2015/9/8/chartex" xmlns:cx2="http://schemas.microsoft.com/office/drawing/2015/10/21/chartex" xmlns:cx3="http://schemas.microsoft.com/office/drawing/2016/5/9/chartex" xmlns:cx4="http://schemas.microsoft.com/office/drawing/2016/5/10/chartex" xmlns:cx5="http://schemas.microsoft.com/office/drawing/2016/5/11/chartex" xmlns:cx6="http://schemas.microsoft.com/office/drawing/2016/5/12/chartex" xmlns:cx7="http://schemas.microsoft.com/office/drawing/2016/5/13/chartex" xmlns:cx8="http://schemas.microsoft.com/office/drawing/2016/5/14/chartex" xmlns:mc="http://schemas.openxmlformats.org/markup-compatibility/2006" xmlns:aink="http://schemas.microsoft.com/office/drawing/2016/ink" xmlns:am3d="http://schemas.microsoft.com/office/drawing/2017/model3d" xmlns:o="urn:schemas-microsoft-com:office:office" xmlns:r="http://schemas.openxmlformats.org/officeDocument/2006/relationships" xmlns:m="http://schemas.openxmlformats.org/officeDocument/2006/math" xmlns:v="urn:schemas-microsoft-com:vml" xmlns:wp14="http://schemas.microsoft.com/office/word/2010/wordprocessingDrawing" xmlns:wp="http://schemas.openxmlformats.org/drawingml/2006/wordprocessingDrawing" xmlns:w10="urn:schemas-microsoft-com:office:word" xmlns:w="http://schemas.openxmlformats.org/wordprocessingml/2006/main" xmlns:w14="http://schemas.microsoft.com/office/word/2010/wordml" xmlns:w15="http://schemas.microsoft.com/office/word/2012/wordml" xmlns:w16cid="http://schemas.microsoft.com/office/word/2016/wordml/cid" xmlns:w16se="http://schemas.microsoft.com/office/word/2015/wordml/symex" xmlns:wpg="http://schemas.microsoft.com/office/word/2010/wordprocessingGroup" xmlns:wpi="http://schemas.microsoft.com/office/word/2010/wordprocessingInk" xmlns:wne="http://schemas.microsoft.com/office/word/2006/wordml" xmlns:wps="http://schemas.microsoft.com/office/word/2010/wordprocessingShape" mc:Ignorable="w14 w15 w16se w16cid wp14">
   <w:p>
     <w:pPr>
       <w:pBdr>
@@ -929,31 +1022,30 @@
         <w:noProof/>
       </w:rPr>
       <w:drawing>
-        <wp:inline distT="0" distB="0" distL="0" distR="0" wp14:anchorId="604E1AEB" wp14:editId="2F6B9ABD">
-          <wp:extent cx="3852545" cy="901065"/>
-          <wp:effectExtent l="0" t="0" r="0" b="0"/>
+        <wp:inline distT="0" distB="0" distL="0" distR="0" wp14:anchorId="6B7972CF" wp14:editId="2D36673C">
+          <wp:extent cx="3852000" cy="658800"/>
+          <wp:effectExtent l="0" t="0" r="0" b="8255"/>
           <wp:docPr id="2" name="Grafik 2"/>
           <wp:cNvGraphicFramePr>
-            <a:graphicFrameLocks xmlns:a="http://schemas.openxmlformats.org/drawingml/2006/main" noChangeAspect="1"/>
+            <a:graphicFrameLocks xmlns:a="http://schemas.openxmlformats.org/drawingml/2006/main"/>
           </wp:cNvGraphicFramePr>
           <a:graphic xmlns:a="http://schemas.openxmlformats.org/drawingml/2006/main">
             <a:graphicData uri="http://schemas.openxmlformats.org/drawingml/2006/picture">
               <pic:pic xmlns:pic="http://schemas.openxmlformats.org/drawingml/2006/picture">
                 <pic:nvPicPr>
                   <pic:cNvPr id="0" name="Picture 1"/>
-                  <pic:cNvPicPr>
+                  <pic:cNvPicPr preferRelativeResize="0">
                     <a:picLocks noChangeAspect="1" noChangeArrowheads="1"/>
                   </pic:cNvPicPr>
                 </pic:nvPicPr>
                 <pic:blipFill>
-                  <a:blip r:embed="rId1">
+                  <a:blip r:embed="rId1" cstate="print">
                     <a:extLst>
                       <a:ext uri="{28A0092B-C50C-407E-A947-70E740481C1C}">
                         <a14:useLocalDpi xmlns:a14="http://schemas.microsoft.com/office/drawing/2010/main" val="0"/>
                       </a:ext>
                     </a:extLst>
                   </a:blip>
-                  <a:srcRect/>
                   <a:stretch>
                     <a:fillRect/>
                   </a:stretch>
@@ -961,7 +1053,7 @@
                 <pic:spPr bwMode="auto">
                   <a:xfrm>
                     <a:off x="0" y="0"/>
-                    <a:ext cx="3852545" cy="901065"/>
+                    <a:ext cx="3852000" cy="658800"/>
                   </a:xfrm>
                   <a:prstGeom prst="rect">
                     <a:avLst/>
@@ -982,7 +1074,7 @@
 </file>
 
 <file path=word/numbering.xml><?xml version="1.0" encoding="utf-8"?>
-<w:numbering xmlns:wpc="http://schemas.microsoft.com/office/word/2010/wordprocessingCanvas" xmlns:cx="http://schemas.microsoft.com/office/drawing/2014/chartex" xmlns:cx1="http://schemas.microsoft.com/office/drawing/2015/9/8/chartex" xmlns:cx2="http://schemas.microsoft.com/office/drawing/2015/10/21/chartex" xmlns:cx3="http://schemas.microsoft.com/office/drawing/2016/5/9/chartex" xmlns:cx4="http://schemas.microsoft.com/office/drawing/2016/5/10/chartex" xmlns:cx5="http://schemas.microsoft.com/office/drawing/2016/5/11/chartex" xmlns:cx6="http://schemas.microsoft.com/office/drawing/2016/5/12/chartex" xmlns:cx7="http://schemas.microsoft.com/office/drawing/2016/5/13/chartex" xmlns:cx8="http://schemas.microsoft.com/office/drawing/2016/5/14/chartex" xmlns:mc="http://schemas.openxmlformats.org/markup-compatibility/2006" xmlns:aink="http://schemas.microsoft.com/office/drawing/2016/ink" xmlns:am3d="http://schemas.microsoft.com/office/drawing/2017/model3d" xmlns:o="urn:schemas-microsoft-com:office:office" xmlns:r="http://schemas.openxmlformats.org/officeDocument/2006/relationships" xmlns:m="http://schemas.openxmlformats.org/officeDocument/2006/math" xmlns:v="urn:schemas-microsoft-com:vml" xmlns:wp14="http://schemas.microsoft.com/office/word/2010/wordprocessingDrawing" xmlns:wp="http://schemas.openxmlformats.org/drawingml/2006/wordprocessingDrawing" xmlns:w10="urn:schemas-microsoft-com:office:word" xmlns:w="http://schemas.openxmlformats.org/wordprocessingml/2006/main" xmlns:w14="http://schemas.microsoft.com/office/word/2010/wordml" xmlns:w15="http://schemas.microsoft.com/office/word/2012/wordml" xmlns:w16cex="http://schemas.microsoft.com/office/word/2018/wordml/cex" xmlns:w16cid="http://schemas.microsoft.com/office/word/2016/wordml/cid" xmlns:w16="http://schemas.microsoft.com/office/word/2018/wordml" xmlns:w16sdtdh="http://schemas.microsoft.com/office/word/2020/wordml/sdtdatahash" xmlns:w16se="http://schemas.microsoft.com/office/word/2015/wordml/symex" xmlns:wpg="http://schemas.microsoft.com/office/word/2010/wordprocessingGroup" xmlns:wpi="http://schemas.microsoft.com/office/word/2010/wordprocessingInk" xmlns:wne="http://schemas.microsoft.com/office/word/2006/wordml" xmlns:wps="http://schemas.microsoft.com/office/word/2010/wordprocessingShape" mc:Ignorable="w14 w15 w16se w16cid w16 w16cex w16sdtdh wp14">
+<w:numbering xmlns:wpc="http://schemas.microsoft.com/office/word/2010/wordprocessingCanvas" xmlns:cx="http://schemas.microsoft.com/office/drawing/2014/chartex" xmlns:cx1="http://schemas.microsoft.com/office/drawing/2015/9/8/chartex" xmlns:cx2="http://schemas.microsoft.com/office/drawing/2015/10/21/chartex" xmlns:cx3="http://schemas.microsoft.com/office/drawing/2016/5/9/chartex" xmlns:cx4="http://schemas.microsoft.com/office/drawing/2016/5/10/chartex" xmlns:cx5="http://schemas.microsoft.com/office/drawing/2016/5/11/chartex" xmlns:cx6="http://schemas.microsoft.com/office/drawing/2016/5/12/chartex" xmlns:cx7="http://schemas.microsoft.com/office/drawing/2016/5/13/chartex" xmlns:cx8="http://schemas.microsoft.com/office/drawing/2016/5/14/chartex" xmlns:mc="http://schemas.openxmlformats.org/markup-compatibility/2006" xmlns:aink="http://schemas.microsoft.com/office/drawing/2016/ink" xmlns:am3d="http://schemas.microsoft.com/office/drawing/2017/model3d" xmlns:o="urn:schemas-microsoft-com:office:office" xmlns:r="http://schemas.openxmlformats.org/officeDocument/2006/relationships" xmlns:m="http://schemas.openxmlformats.org/officeDocument/2006/math" xmlns:v="urn:schemas-microsoft-com:vml" xmlns:wp14="http://schemas.microsoft.com/office/word/2010/wordprocessingDrawing" xmlns:wp="http://schemas.openxmlformats.org/drawingml/2006/wordprocessingDrawing" xmlns:w10="urn:schemas-microsoft-com:office:word" xmlns:w="http://schemas.openxmlformats.org/wordprocessingml/2006/main" xmlns:w14="http://schemas.microsoft.com/office/word/2010/wordml" xmlns:w15="http://schemas.microsoft.com/office/word/2012/wordml" xmlns:w16cid="http://schemas.microsoft.com/office/word/2016/wordml/cid" xmlns:w16se="http://schemas.microsoft.com/office/word/2015/wordml/symex" xmlns:wpg="http://schemas.microsoft.com/office/word/2010/wordprocessingGroup" xmlns:wpi="http://schemas.microsoft.com/office/word/2010/wordprocessingInk" xmlns:wne="http://schemas.microsoft.com/office/word/2006/wordml" xmlns:wps="http://schemas.microsoft.com/office/word/2010/wordprocessingShape" mc:Ignorable="w14 w15 w16se w16cid wp14">
   <w:abstractNum w:abstractNumId="0" w15:restartNumberingAfterBreak="0">
     <w:nsid w:val="08527184"/>
     <w:multiLevelType w:val="hybridMultilevel"/>
@@ -1564,6 +1656,155 @@
       <w:pPr>
         <w:ind w:left="4320" w:hanging="1440"/>
       </w:pPr>
+    </w:lvl>
+  </w:abstractNum>
+  <w:abstractNum w:abstractNumId="6" w15:restartNumberingAfterBreak="0">
+    <w:nsid w:val="7232413D"/>
+    <w:multiLevelType w:val="multilevel"/>
+    <w:tmpl w:val="0B44B424"/>
+    <w:lvl w:ilvl="0">
+      <w:start w:val="1"/>
+      <w:numFmt w:val="bullet"/>
+      <w:lvlText w:val=""/>
+      <w:lvlJc w:val="left"/>
+      <w:pPr>
+        <w:tabs>
+          <w:tab w:val="num" w:pos="720"/>
+        </w:tabs>
+        <w:ind w:left="720" w:hanging="360"/>
+      </w:pPr>
+      <w:rPr>
+        <w:rFonts w:ascii="Symbol" w:hAnsi="Symbol" w:hint="default"/>
+        <w:sz w:val="20"/>
+      </w:rPr>
+    </w:lvl>
+    <w:lvl w:ilvl="1" w:tentative="1">
+      <w:start w:val="1"/>
+      <w:numFmt w:val="bullet"/>
+      <w:lvlText w:val="o"/>
+      <w:lvlJc w:val="left"/>
+      <w:pPr>
+        <w:tabs>
+          <w:tab w:val="num" w:pos="1440"/>
+        </w:tabs>
+        <w:ind w:left="1440" w:hanging="360"/>
+      </w:pPr>
+      <w:rPr>
+        <w:rFonts w:ascii="Courier New" w:hAnsi="Courier New" w:hint="default"/>
+        <w:sz w:val="20"/>
+      </w:rPr>
+    </w:lvl>
+    <w:lvl w:ilvl="2" w:tentative="1">
+      <w:start w:val="1"/>
+      <w:numFmt w:val="bullet"/>
+      <w:lvlText w:val=""/>
+      <w:lvlJc w:val="left"/>
+      <w:pPr>
+        <w:tabs>
+          <w:tab w:val="num" w:pos="2160"/>
+        </w:tabs>
+        <w:ind w:left="2160" w:hanging="360"/>
+      </w:pPr>
+      <w:rPr>
+        <w:rFonts w:ascii="Wingdings" w:hAnsi="Wingdings" w:hint="default"/>
+        <w:sz w:val="20"/>
+      </w:rPr>
+    </w:lvl>
+    <w:lvl w:ilvl="3" w:tentative="1">
+      <w:start w:val="1"/>
+      <w:numFmt w:val="bullet"/>
+      <w:lvlText w:val=""/>
+      <w:lvlJc w:val="left"/>
+      <w:pPr>
+        <w:tabs>
+          <w:tab w:val="num" w:pos="2880"/>
+        </w:tabs>
+        <w:ind w:left="2880" w:hanging="360"/>
+      </w:pPr>
+      <w:rPr>
+        <w:rFonts w:ascii="Wingdings" w:hAnsi="Wingdings" w:hint="default"/>
+        <w:sz w:val="20"/>
+      </w:rPr>
+    </w:lvl>
+    <w:lvl w:ilvl="4" w:tentative="1">
+      <w:start w:val="1"/>
+      <w:numFmt w:val="bullet"/>
+      <w:lvlText w:val=""/>
+      <w:lvlJc w:val="left"/>
+      <w:pPr>
+        <w:tabs>
+          <w:tab w:val="num" w:pos="3600"/>
+        </w:tabs>
+        <w:ind w:left="3600" w:hanging="360"/>
+      </w:pPr>
+      <w:rPr>
+        <w:rFonts w:ascii="Wingdings" w:hAnsi="Wingdings" w:hint="default"/>
+        <w:sz w:val="20"/>
+      </w:rPr>
+    </w:lvl>
+    <w:lvl w:ilvl="5" w:tentative="1">
+      <w:start w:val="1"/>
+      <w:numFmt w:val="bullet"/>
+      <w:lvlText w:val=""/>
+      <w:lvlJc w:val="left"/>
+      <w:pPr>
+        <w:tabs>
+          <w:tab w:val="num" w:pos="4320"/>
+        </w:tabs>
+        <w:ind w:left="4320" w:hanging="360"/>
+      </w:pPr>
+      <w:rPr>
+        <w:rFonts w:ascii="Wingdings" w:hAnsi="Wingdings" w:hint="default"/>
+        <w:sz w:val="20"/>
+      </w:rPr>
+    </w:lvl>
+    <w:lvl w:ilvl="6" w:tentative="1">
+      <w:start w:val="1"/>
+      <w:numFmt w:val="bullet"/>
+      <w:lvlText w:val=""/>
+      <w:lvlJc w:val="left"/>
+      <w:pPr>
+        <w:tabs>
+          <w:tab w:val="num" w:pos="5040"/>
+        </w:tabs>
+        <w:ind w:left="5040" w:hanging="360"/>
+      </w:pPr>
+      <w:rPr>
+        <w:rFonts w:ascii="Wingdings" w:hAnsi="Wingdings" w:hint="default"/>
+        <w:sz w:val="20"/>
+      </w:rPr>
+    </w:lvl>
+    <w:lvl w:ilvl="7" w:tentative="1">
+      <w:start w:val="1"/>
+      <w:numFmt w:val="bullet"/>
+      <w:lvlText w:val=""/>
+      <w:lvlJc w:val="left"/>
+      <w:pPr>
+        <w:tabs>
+          <w:tab w:val="num" w:pos="5760"/>
+        </w:tabs>
+        <w:ind w:left="5760" w:hanging="360"/>
+      </w:pPr>
+      <w:rPr>
+        <w:rFonts w:ascii="Wingdings" w:hAnsi="Wingdings" w:hint="default"/>
+        <w:sz w:val="20"/>
+      </w:rPr>
+    </w:lvl>
+    <w:lvl w:ilvl="8" w:tentative="1">
+      <w:start w:val="1"/>
+      <w:numFmt w:val="bullet"/>
+      <w:lvlText w:val=""/>
+      <w:lvlJc w:val="left"/>
+      <w:pPr>
+        <w:tabs>
+          <w:tab w:val="num" w:pos="6480"/>
+        </w:tabs>
+        <w:ind w:left="6480" w:hanging="360"/>
+      </w:pPr>
+      <w:rPr>
+        <w:rFonts w:ascii="Wingdings" w:hAnsi="Wingdings" w:hint="default"/>
+        <w:sz w:val="20"/>
+      </w:rPr>
     </w:lvl>
   </w:abstractNum>
   <w:num w:numId="1">
@@ -1584,11 +1825,14 @@
   <w:num w:numId="6">
     <w:abstractNumId w:val="5"/>
   </w:num>
+  <w:num w:numId="7">
+    <w:abstractNumId w:val="6"/>
+  </w:num>
 </w:numbering>
 </file>
 
 <file path=word/styles.xml><?xml version="1.0" encoding="utf-8"?>
-<w:styles xmlns:mc="http://schemas.openxmlformats.org/markup-compatibility/2006" xmlns:r="http://schemas.openxmlformats.org/officeDocument/2006/relationships" xmlns:w="http://schemas.openxmlformats.org/wordprocessingml/2006/main" xmlns:w14="http://schemas.microsoft.com/office/word/2010/wordml" xmlns:w15="http://schemas.microsoft.com/office/word/2012/wordml" xmlns:w16cex="http://schemas.microsoft.com/office/word/2018/wordml/cex" xmlns:w16cid="http://schemas.microsoft.com/office/word/2016/wordml/cid" xmlns:w16="http://schemas.microsoft.com/office/word/2018/wordml" xmlns:w16sdtdh="http://schemas.microsoft.com/office/word/2020/wordml/sdtdatahash" xmlns:w16se="http://schemas.microsoft.com/office/word/2015/wordml/symex" mc:Ignorable="w14 w15 w16se w16cid w16 w16cex w16sdtdh">
+<w:styles xmlns:mc="http://schemas.openxmlformats.org/markup-compatibility/2006" xmlns:r="http://schemas.openxmlformats.org/officeDocument/2006/relationships" xmlns:w="http://schemas.openxmlformats.org/wordprocessingml/2006/main" xmlns:w14="http://schemas.microsoft.com/office/word/2010/wordml" xmlns:w15="http://schemas.microsoft.com/office/word/2012/wordml" xmlns:w16cid="http://schemas.microsoft.com/office/word/2016/wordml/cid" xmlns:w16se="http://schemas.microsoft.com/office/word/2015/wordml/symex" mc:Ignorable="w14 w15 w16se w16cid">
   <w:docDefaults>
     <w:rPrDefault>
       <w:rPr>
@@ -1604,7 +1848,7 @@
       </w:pPr>
     </w:pPrDefault>
   </w:docDefaults>
-  <w:latentStyles w:defLockedState="0" w:defUIPriority="99" w:defSemiHidden="0" w:defUnhideWhenUsed="0" w:defQFormat="0" w:count="376">
+  <w:latentStyles w:defLockedState="0" w:defUIPriority="99" w:defSemiHidden="0" w:defUnhideWhenUsed="0" w:defQFormat="0" w:count="375">
     <w:lsdException w:name="Normal" w:uiPriority="0" w:qFormat="1"/>
     <w:lsdException w:name="heading 1" w:uiPriority="9" w:qFormat="1"/>
     <w:lsdException w:name="heading 2" w:semiHidden="1" w:uiPriority="9" w:unhideWhenUsed="1" w:qFormat="1"/>
@@ -1980,7 +2224,6 @@
     <w:lsdException w:name="Smart Hyperlink" w:semiHidden="1" w:unhideWhenUsed="1"/>
     <w:lsdException w:name="Hashtag" w:semiHidden="1" w:unhideWhenUsed="1"/>
     <w:lsdException w:name="Unresolved Mention" w:semiHidden="1" w:unhideWhenUsed="1"/>
-    <w:lsdException w:name="Smart Link" w:semiHidden="1" w:unhideWhenUsed="1"/>
   </w:latentStyles>
   <w:style w:type="paragraph" w:default="1" w:styleId="Standard">
     <w:name w:val="Normal"/>
@@ -2259,6 +2502,7 @@
   </w:style>
   <w:style w:type="paragraph" w:styleId="KeinLeerraum">
     <w:name w:val="No Spacing"/>
+    <w:link w:val="KeinLeerraumZchn"/>
     <w:uiPriority w:val="1"/>
     <w:qFormat/>
     <w:rsid w:val="00680605"/>
@@ -2268,6 +2512,45 @@
     <w:rPr>
       <w:rFonts w:asciiTheme="minorHAnsi" w:eastAsiaTheme="minorHAnsi" w:hAnsiTheme="minorHAnsi" w:cstheme="minorBidi"/>
       <w:lang w:val="bg-BG" w:eastAsia="en-US"/>
+    </w:rPr>
+  </w:style>
+  <w:style w:type="character" w:customStyle="1" w:styleId="KeinLeerraumZchn">
+    <w:name w:val="Kein Leerraum Zchn"/>
+    <w:basedOn w:val="Absatz-Standardschriftart"/>
+    <w:link w:val="KeinLeerraum"/>
+    <w:uiPriority w:val="1"/>
+    <w:rsid w:val="00C712BC"/>
+    <w:rPr>
+      <w:rFonts w:asciiTheme="minorHAnsi" w:eastAsiaTheme="minorHAnsi" w:hAnsiTheme="minorHAnsi" w:cstheme="minorBidi"/>
+      <w:lang w:val="bg-BG" w:eastAsia="en-US"/>
+    </w:rPr>
+  </w:style>
+  <w:style w:type="paragraph" w:styleId="StandardWeb">
+    <w:name w:val="Normal (Web)"/>
+    <w:basedOn w:val="Standard"/>
+    <w:uiPriority w:val="99"/>
+    <w:semiHidden/>
+    <w:unhideWhenUsed/>
+    <w:rsid w:val="00FD3896"/>
+    <w:pPr>
+      <w:spacing w:before="100" w:beforeAutospacing="1" w:after="100" w:afterAutospacing="1" w:line="240" w:lineRule="auto"/>
+    </w:pPr>
+    <w:rPr>
+      <w:rFonts w:ascii="Times New Roman" w:eastAsia="Times New Roman" w:hAnsi="Times New Roman" w:cs="Times New Roman"/>
+      <w:sz w:val="24"/>
+      <w:szCs w:val="24"/>
+      <w:lang w:val="en-US" w:eastAsia="en-US"/>
+    </w:rPr>
+  </w:style>
+  <w:style w:type="character" w:styleId="Fett">
+    <w:name w:val="Strong"/>
+    <w:basedOn w:val="Absatz-Standardschriftart"/>
+    <w:uiPriority w:val="22"/>
+    <w:qFormat/>
+    <w:rsid w:val="00FD3896"/>
+    <w:rPr>
+      <w:b/>
+      <w:bCs/>
     </w:rPr>
   </w:style>
 </w:styles>
@@ -2594,30 +2877,6 @@
 </file>
 
 <file path=customXml/item1.xml><?xml version="1.0" encoding="utf-8"?>
-<b:Sources xmlns:b="http://schemas.openxmlformats.org/officeDocument/2006/bibliography" xmlns="http://schemas.openxmlformats.org/officeDocument/2006/bibliography" SelectedStyle="\APASixthEditionOfficeOnline.xsl" StyleName="APA" Version="6"/>
-</file>
-
-<file path=customXml/item2.xml><?xml version="1.0" encoding="utf-8"?>
-<p:properties xmlns:p="http://schemas.microsoft.com/office/2006/metadata/properties" xmlns:xsi="http://www.w3.org/2001/XMLSchema-instance" xmlns:pc="http://schemas.microsoft.com/office/infopath/2007/PartnerControls">
-  <documentManagement>
-    <lcf76f155ced4ddcb4097134ff3c332f xmlns="69b70055-4ccd-41e5-ba44-04aa7b40ef87">
-      <Terms xmlns="http://schemas.microsoft.com/office/infopath/2007/PartnerControls"/>
-    </lcf76f155ced4ddcb4097134ff3c332f>
-    <TaxCatchAll xmlns="0d7d4427-3d9a-4210-88a6-80411ae356c7" xsi:nil="true"/>
-  </documentManagement>
-</p:properties>
-</file>
-
-<file path=customXml/item3.xml><?xml version="1.0" encoding="utf-8"?>
-<?mso-contentType ?>
-<FormTemplates xmlns="http://schemas.microsoft.com/sharepoint/v3/contenttype/forms">
-  <Display>DocumentLibraryForm</Display>
-  <Edit>DocumentLibraryForm</Edit>
-  <New>DocumentLibraryForm</New>
-</FormTemplates>
-</file>
-
-<file path=customXml/item4.xml><?xml version="1.0" encoding="utf-8"?>
 <ct:contentTypeSchema xmlns:ct="http://schemas.microsoft.com/office/2006/metadata/contentType" xmlns:ma="http://schemas.microsoft.com/office/2006/metadata/properties/metaAttributes" ct:_="" ma:_="" ma:contentTypeName="Document" ma:contentTypeID="0x010100202D4B9E3A436A44B91CC234F5A1B18B" ma:contentTypeVersion="11" ma:contentTypeDescription="Create a new document." ma:contentTypeScope="" ma:versionID="faa7d1780a64debc3e5433f1993c437a">
   <xsd:schema xmlns:xsd="http://www.w3.org/2001/XMLSchema" xmlns:xs="http://www.w3.org/2001/XMLSchema" xmlns:p="http://schemas.microsoft.com/office/2006/metadata/properties" xmlns:ns2="69b70055-4ccd-41e5-ba44-04aa7b40ef87" xmlns:ns3="0d7d4427-3d9a-4210-88a6-80411ae356c7" targetNamespace="http://schemas.microsoft.com/office/2006/metadata/properties" ma:root="true" ma:fieldsID="46ac9b7ec201ca2a68a6a1e758789984" ns2:_="" ns3:_="">
     <xsd:import namespace="69b70055-4ccd-41e5-ba44-04aa7b40ef87"/>
@@ -2812,34 +3071,31 @@
 </ct:contentTypeSchema>
 </file>
 
-<file path=customXml/itemProps1.xml><?xml version="1.0" encoding="utf-8"?>
-<ds:datastoreItem xmlns:ds="http://schemas.openxmlformats.org/officeDocument/2006/customXml" ds:itemID="{3E9A7EEA-314E-4AAC-8D07-7ACA3034AAFD}">
-  <ds:schemaRefs>
-    <ds:schemaRef ds:uri="http://schemas.openxmlformats.org/officeDocument/2006/bibliography"/>
-  </ds:schemaRefs>
-</ds:datastoreItem>
+<file path=customXml/item2.xml><?xml version="1.0" encoding="utf-8"?>
+<?mso-contentType ?>
+<FormTemplates xmlns="http://schemas.microsoft.com/sharepoint/v3/contenttype/forms">
+  <Display>DocumentLibraryForm</Display>
+  <Edit>DocumentLibraryForm</Edit>
+  <New>DocumentLibraryForm</New>
+</FormTemplates>
 </file>
 
-<file path=customXml/itemProps2.xml><?xml version="1.0" encoding="utf-8"?>
-<ds:datastoreItem xmlns:ds="http://schemas.openxmlformats.org/officeDocument/2006/customXml" ds:itemID="{964D309B-262C-43E0-A89D-5ECCFDE243CA}">
-  <ds:schemaRefs>
-    <ds:schemaRef ds:uri="http://schemas.microsoft.com/office/2006/metadata/properties"/>
-    <ds:schemaRef ds:uri="http://schemas.microsoft.com/office/infopath/2007/PartnerControls"/>
-    <ds:schemaRef ds:uri="69b70055-4ccd-41e5-ba44-04aa7b40ef87"/>
-    <ds:schemaRef ds:uri="0d7d4427-3d9a-4210-88a6-80411ae356c7"/>
-  </ds:schemaRefs>
-</ds:datastoreItem>
+<file path=customXml/item3.xml><?xml version="1.0" encoding="utf-8"?>
+<p:properties xmlns:p="http://schemas.microsoft.com/office/2006/metadata/properties" xmlns:xsi="http://www.w3.org/2001/XMLSchema-instance" xmlns:pc="http://schemas.microsoft.com/office/infopath/2007/PartnerControls">
+  <documentManagement>
+    <lcf76f155ced4ddcb4097134ff3c332f xmlns="69b70055-4ccd-41e5-ba44-04aa7b40ef87">
+      <Terms xmlns="http://schemas.microsoft.com/office/infopath/2007/PartnerControls"/>
+    </lcf76f155ced4ddcb4097134ff3c332f>
+    <TaxCatchAll xmlns="0d7d4427-3d9a-4210-88a6-80411ae356c7" xsi:nil="true"/>
+  </documentManagement>
+</p:properties>
 </file>
 
-<file path=customXml/itemProps3.xml><?xml version="1.0" encoding="utf-8"?>
-<ds:datastoreItem xmlns:ds="http://schemas.openxmlformats.org/officeDocument/2006/customXml" ds:itemID="{D56D2064-8FB9-4E1E-BC3B-97035ABCDEBA}">
-  <ds:schemaRefs>
-    <ds:schemaRef ds:uri="http://schemas.microsoft.com/sharepoint/v3/contenttype/forms"/>
-  </ds:schemaRefs>
-</ds:datastoreItem>
+<file path=customXml/item4.xml><?xml version="1.0" encoding="utf-8"?>
+<b:Sources xmlns:b="http://schemas.openxmlformats.org/officeDocument/2006/bibliography" xmlns="http://schemas.openxmlformats.org/officeDocument/2006/bibliography" SelectedStyle="\APASixthEditionOfficeOnline.xsl" StyleName="APA" Version="6"/>
 </file>
 
-<file path=customXml/itemProps4.xml><?xml version="1.0" encoding="utf-8"?>
+<file path=customXml/itemProps1.xml><?xml version="1.0" encoding="utf-8"?>
 <ds:datastoreItem xmlns:ds="http://schemas.openxmlformats.org/officeDocument/2006/customXml" ds:itemID="{97231DAB-778A-4B70-B468-7BDAF864CED7}">
   <ds:schemaRefs>
     <ds:schemaRef ds:uri="http://schemas.microsoft.com/office/2006/metadata/contentType"/>
@@ -2856,4 +3112,31 @@
     <ds:schemaRef ds:uri="http://schemas.microsoft.com/internal/obd"/>
   </ds:schemaRefs>
 </ds:datastoreItem>
+</file>
+
+<file path=customXml/itemProps2.xml><?xml version="1.0" encoding="utf-8"?>
+<ds:datastoreItem xmlns:ds="http://schemas.openxmlformats.org/officeDocument/2006/customXml" ds:itemID="{D56D2064-8FB9-4E1E-BC3B-97035ABCDEBA}">
+  <ds:schemaRefs>
+    <ds:schemaRef ds:uri="http://schemas.microsoft.com/sharepoint/v3/contenttype/forms"/>
+  </ds:schemaRefs>
+</ds:datastoreItem>
+</file>
+
+<file path=customXml/itemProps3.xml><?xml version="1.0" encoding="utf-8"?>
+<ds:datastoreItem xmlns:ds="http://schemas.openxmlformats.org/officeDocument/2006/customXml" ds:itemID="{964D309B-262C-43E0-A89D-5ECCFDE243CA}">
+  <ds:schemaRefs>
+    <ds:schemaRef ds:uri="http://schemas.microsoft.com/office/2006/metadata/properties"/>
+    <ds:schemaRef ds:uri="http://schemas.microsoft.com/office/infopath/2007/PartnerControls"/>
+    <ds:schemaRef ds:uri="69b70055-4ccd-41e5-ba44-04aa7b40ef87"/>
+    <ds:schemaRef ds:uri="0d7d4427-3d9a-4210-88a6-80411ae356c7"/>
+  </ds:schemaRefs>
+</ds:datastoreItem>
+</file>
+
+<file path=customXml/itemProps4.xml><?xml version="1.0" encoding="utf-8"?>
+<ds:datastoreItem xmlns:ds="http://schemas.openxmlformats.org/officeDocument/2006/customXml" ds:itemID="{96EFEEAC-6322-43E0-AEA4-A21B4CB992C3}">
+  <ds:schemaRefs>
+    <ds:schemaRef ds:uri="http://schemas.openxmlformats.org/officeDocument/2006/bibliography"/>
+  </ds:schemaRefs>
+</ds:datastoreItem>
 </file>
</xml_diff>